<commit_message>
Questionnaire au format formulaire : cases à cocher et cases numériques
- Cases à cocher pour les questions qualitatives (une seule / plusieurs réponses)
- Cases numériques |__| pour les questions quantitatives (avec unités et décimales)
- Bandeaux de section, fiche technique d'entretien, consignes de remplissage
- Tableau de classement des produits (volet B) et grille de recensement du
  personnel (volet D) avec en-têtes répétés en cas de saut de page

Co-Authored-By: Claude Fable 5 <noreply@anthropic.com>
Claude-Session: https://claude.ai/code/session_01L8Gx8Yawmd4RBuYpXHqCkx
</commit_message>
<xml_diff>
--- a/Projet_IFC/Questionnaire_enquete_IFC.docx
+++ b/Projet_IFC/Questionnaire_enquete_IFC.docx
@@ -2,476 +2,270 @@
 <file path=word/document.xml><?xml version="1.0" encoding="utf-8"?>
 <w:document xmlns:wpc="http://schemas.microsoft.com/office/word/2010/wordprocessingCanvas" xmlns:mo="http://schemas.microsoft.com/office/mac/office/2008/main" xmlns:mc="http://schemas.openxmlformats.org/markup-compatibility/2006" xmlns:mv="urn:schemas-microsoft-com:mac:vml" xmlns:o="urn:schemas-microsoft-com:office:office" xmlns:r="http://schemas.openxmlformats.org/officeDocument/2006/relationships" xmlns:m="http://schemas.openxmlformats.org/officeDocument/2006/math" xmlns:v="urn:schemas-microsoft-com:vml" xmlns:wp14="http://schemas.microsoft.com/office/word/2010/wordprocessingDrawing" xmlns:wp="http://schemas.openxmlformats.org/drawingml/2006/wordprocessingDrawing" xmlns:w10="urn:schemas-microsoft-com:office:word" xmlns:w="http://schemas.openxmlformats.org/wordprocessingml/2006/main" xmlns:w14="http://schemas.microsoft.com/office/word/2010/wordml" xmlns:wpg="http://schemas.microsoft.com/office/word/2010/wordprocessingGroup" xmlns:wpi="http://schemas.microsoft.com/office/word/2010/wordprocessingInk" xmlns:wne="http://schemas.microsoft.com/office/word/2006/wordml" xmlns:wps="http://schemas.microsoft.com/office/word/2010/wordprocessingShape" mc:Ignorable="w14 wp14">
   <w:body>
+    <w:tbl>
+      <w:tblPr>
+        <w:tblStyle w:val="TableGrid"/>
+        <w:tblW w:type="auto" w:w="0"/>
+        <w:tblLook w:firstColumn="1" w:firstRow="1" w:lastColumn="0" w:lastRow="0" w:noHBand="0" w:noVBand="1" w:val="04A0"/>
+      </w:tblPr>
+      <w:tblGrid>
+        <w:gridCol w:w="9972"/>
+      </w:tblGrid>
+      <w:tr>
+        <w:tc>
+          <w:tcPr>
+            <w:tcW w:type="dxa" w:w="9972"/>
+            <w:shd w:val="clear" w:fill="F2F2F2"/>
+          </w:tcPr>
+          <w:p>
+            <w:pPr>
+              <w:jc w:val="center"/>
+            </w:pPr>
+            <w:r/>
+            <w:r>
+              <w:rPr>
+                <w:b/>
+                <w:i w:val="0"/>
+                <w:sz w:val="22"/>
+              </w:rPr>
+              <w:t>ENSAE Pierre Ndiaye — ISE 3 — Méthodes actuarielles / Assurance vie</w:t>
+            </w:r>
+          </w:p>
+        </w:tc>
+      </w:tr>
+      <w:tr>
+        <w:tc>
+          <w:tcPr>
+            <w:tcW w:type="dxa" w:w="9972"/>
+            <w:shd w:val="clear" w:fill="404040"/>
+          </w:tcPr>
+          <w:p>
+            <w:pPr>
+              <w:jc w:val="center"/>
+            </w:pPr>
+            <w:r/>
+            <w:r>
+              <w:rPr>
+                <w:b/>
+                <w:i w:val="0"/>
+                <w:color w:val="FFFFFF"/>
+                <w:sz w:val="28"/>
+              </w:rPr>
+              <w:t>PROJET I — ENQUÊTE AUPRÈS DES INSTITUTIONS D'ASSURANCE</w:t>
+            </w:r>
+          </w:p>
+        </w:tc>
+      </w:tr>
+      <w:tr>
+        <w:tc>
+          <w:tcPr>
+            <w:tcW w:type="dxa" w:w="9972"/>
+          </w:tcPr>
+          <w:p>
+            <w:pPr>
+              <w:jc w:val="center"/>
+            </w:pPr>
+            <w:r/>
+            <w:r>
+              <w:rPr>
+                <w:b w:val="0"/>
+                <w:i/>
+                <w:sz w:val="21"/>
+              </w:rPr>
+              <w:t>Questionnaire de recueil des produits d'assurance vie et de collecte des données de tarification</w:t>
+              <w:br/>
+              <w:t>Enquêteur : Sié Rachid Traoré — Année académique 2025-2026</w:t>
+            </w:r>
+          </w:p>
+        </w:tc>
+      </w:tr>
+    </w:tbl>
+    <w:p/>
+    <w:tbl>
+      <w:tblPr>
+        <w:tblStyle w:val="TableGrid"/>
+        <w:tblW w:type="auto" w:w="0"/>
+        <w:tblLook w:firstColumn="1" w:firstRow="1" w:lastColumn="0" w:lastRow="0" w:noHBand="0" w:noVBand="1" w:val="04A0"/>
+      </w:tblPr>
+      <w:tblGrid>
+        <w:gridCol w:w="2493"/>
+        <w:gridCol w:w="2493"/>
+        <w:gridCol w:w="2493"/>
+        <w:gridCol w:w="2493"/>
+      </w:tblGrid>
+      <w:tr>
+        <w:tc>
+          <w:tcPr>
+            <w:tcW w:type="dxa" w:w="2493"/>
+            <w:shd w:val="clear" w:fill="D9D9D9"/>
+          </w:tcPr>
+          <w:p>
+            <w:pPr>
+              <w:jc w:val="center"/>
+            </w:pPr>
+            <w:r/>
+            <w:r>
+              <w:rPr>
+                <w:b/>
+                <w:i w:val="0"/>
+                <w:sz w:val="18"/>
+              </w:rPr>
+              <w:t>N° du questionnaire</w:t>
+            </w:r>
+          </w:p>
+        </w:tc>
+        <w:tc>
+          <w:tcPr>
+            <w:tcW w:type="dxa" w:w="2493"/>
+            <w:shd w:val="clear" w:fill="D9D9D9"/>
+          </w:tcPr>
+          <w:p>
+            <w:pPr>
+              <w:jc w:val="center"/>
+            </w:pPr>
+            <w:r/>
+            <w:r>
+              <w:rPr>
+                <w:b/>
+                <w:i w:val="0"/>
+                <w:sz w:val="18"/>
+              </w:rPr>
+              <w:t>Date de l'entretien</w:t>
+            </w:r>
+          </w:p>
+        </w:tc>
+        <w:tc>
+          <w:tcPr>
+            <w:tcW w:type="dxa" w:w="2493"/>
+            <w:shd w:val="clear" w:fill="D9D9D9"/>
+          </w:tcPr>
+          <w:p>
+            <w:pPr>
+              <w:jc w:val="center"/>
+            </w:pPr>
+            <w:r/>
+            <w:r>
+              <w:rPr>
+                <w:b/>
+                <w:i w:val="0"/>
+                <w:sz w:val="18"/>
+              </w:rPr>
+              <w:t>Heure de début</w:t>
+            </w:r>
+          </w:p>
+        </w:tc>
+        <w:tc>
+          <w:tcPr>
+            <w:tcW w:type="dxa" w:w="2493"/>
+            <w:shd w:val="clear" w:fill="D9D9D9"/>
+          </w:tcPr>
+          <w:p>
+            <w:pPr>
+              <w:jc w:val="center"/>
+            </w:pPr>
+            <w:r/>
+            <w:r>
+              <w:rPr>
+                <w:b/>
+                <w:i w:val="0"/>
+                <w:sz w:val="18"/>
+              </w:rPr>
+              <w:t>Durée (min)</w:t>
+            </w:r>
+          </w:p>
+        </w:tc>
+      </w:tr>
+      <w:tr>
+        <w:tc>
+          <w:tcPr>
+            <w:tcW w:type="dxa" w:w="2493"/>
+          </w:tcPr>
+          <w:p>
+            <w:pPr>
+              <w:jc w:val="center"/>
+            </w:pPr>
+            <w:r/>
+            <w:r>
+              <w:rPr>
+                <w:b w:val="0"/>
+                <w:i w:val="0"/>
+                <w:sz w:val="20"/>
+              </w:rPr>
+              <w:t>|__|__|</w:t>
+            </w:r>
+          </w:p>
+        </w:tc>
+        <w:tc>
+          <w:tcPr>
+            <w:tcW w:type="dxa" w:w="2493"/>
+          </w:tcPr>
+          <w:p>
+            <w:pPr>
+              <w:jc w:val="center"/>
+            </w:pPr>
+            <w:r/>
+            <w:r>
+              <w:rPr>
+                <w:b w:val="0"/>
+                <w:i w:val="0"/>
+                <w:sz w:val="20"/>
+              </w:rPr>
+              <w:t>|__|__|/|__|__|/|__|__|__|__|</w:t>
+            </w:r>
+          </w:p>
+        </w:tc>
+        <w:tc>
+          <w:tcPr>
+            <w:tcW w:type="dxa" w:w="2493"/>
+          </w:tcPr>
+          <w:p>
+            <w:pPr>
+              <w:jc w:val="center"/>
+            </w:pPr>
+            <w:r/>
+            <w:r>
+              <w:rPr>
+                <w:b w:val="0"/>
+                <w:i w:val="0"/>
+                <w:sz w:val="20"/>
+              </w:rPr>
+              <w:t>|__|__| h |__|__|</w:t>
+            </w:r>
+          </w:p>
+        </w:tc>
+        <w:tc>
+          <w:tcPr>
+            <w:tcW w:type="dxa" w:w="2493"/>
+          </w:tcPr>
+          <w:p>
+            <w:pPr>
+              <w:jc w:val="center"/>
+            </w:pPr>
+            <w:r/>
+            <w:r>
+              <w:rPr>
+                <w:b w:val="0"/>
+                <w:i w:val="0"/>
+                <w:sz w:val="20"/>
+              </w:rPr>
+              <w:t>|__|__|__|</w:t>
+            </w:r>
+          </w:p>
+        </w:tc>
+      </w:tr>
+    </w:tbl>
     <w:p>
       <w:pPr>
-        <w:spacing w:after="120"/>
-        <w:jc w:val="center"/>
+        <w:spacing w:before="120"/>
       </w:pPr>
       <w:r>
         <w:rPr>
           <w:b/>
-          <w:sz w:val="22"/>
         </w:rPr>
-        <w:t>ENSAE Pierre Ndiaye — ISE 3 — Méthodes actuarielles / Assurance vie</w:t>
-      </w:r>
-    </w:p>
-    <w:p>
-      <w:pPr>
-        <w:spacing w:after="120"/>
-        <w:jc w:val="center"/>
-      </w:pPr>
-      <w:r>
-        <w:rPr>
-          <w:b/>
-          <w:sz w:val="30"/>
-        </w:rPr>
-        <w:t>PROJET I — ENQUÊTE AUPRÈS DES INSTITUTIONS D'ASSURANCE</w:t>
-      </w:r>
-    </w:p>
-    <w:p>
-      <w:pPr>
-        <w:spacing w:after="120"/>
-        <w:jc w:val="center"/>
-      </w:pPr>
-      <w:r>
-        <w:rPr>
-          <w:b/>
-          <w:sz w:val="24"/>
-        </w:rPr>
-        <w:t>Questionnaire de recueil des produits d'assurance vie et de collecte des données de tarification</w:t>
-      </w:r>
-    </w:p>
-    <w:p>
-      <w:pPr>
-        <w:jc w:val="center"/>
-      </w:pPr>
-      <w:r>
-        <w:rPr>
-          <w:i/>
-        </w:rPr>
-        <w:t>Enquêteur : Sié Rachid Traoré — Année académique 2025-2026</w:t>
-      </w:r>
-    </w:p>
-    <w:p>
-      <w:r>
-        <w:t>Objet : recenser les produits d'assurance vie commercialisés sur la place de Dakar, identifier le produit le plus commercialisé et collecter les éléments techniques ainsi que les données de personnel nécessaires à la construction d'une note technique et d'un simulateur de tarification.</w:t>
-      </w:r>
-    </w:p>
-    <w:p>
-      <w:r>
-        <w:t>Confidentialité : les informations recueillies sont strictement anonymisées et utilisées à des fins pédagogiques uniquement.</w:t>
-      </w:r>
-    </w:p>
-    <w:p>
-      <w:pPr>
-        <w:spacing w:before="200" w:after="80"/>
-      </w:pPr>
-      <w:r>
-        <w:rPr>
-          <w:b/>
-          <w:sz w:val="26"/>
-        </w:rPr>
-        <w:t>VOLET A — Identification de l'institution</w:t>
-      </w:r>
-    </w:p>
-    <w:p>
-      <w:r>
-        <w:rPr>
-          <w:b/>
-        </w:rPr>
-        <w:t xml:space="preserve">Q1. </w:t>
+        <w:t xml:space="preserve">Mode de collecte :  </w:t>
       </w:r>
       <w:r>
-        <w:t>Dénomination de la compagnie :</w:t>
-      </w:r>
-    </w:p>
-    <w:p>
-      <w:r>
-        <w:t>…………………………………………………………………………………………………………………………………………………</w:t>
-      </w:r>
-    </w:p>
-    <w:p>
-      <w:r>
-        <w:rPr>
-          <w:b/>
-        </w:rPr>
-        <w:t xml:space="preserve">Q2. </w:t>
-      </w:r>
-      <w:r>
-        <w:t>Statut (SA, mutuelle, filiale de groupe régional…) :</w:t>
-      </w:r>
-    </w:p>
-    <w:p>
-      <w:r>
-        <w:t>…………………………………………………………………………………………………………………………………………………</w:t>
-      </w:r>
-    </w:p>
-    <w:p>
-      <w:r>
-        <w:rPr>
-          <w:b/>
-        </w:rPr>
-        <w:t xml:space="preserve">Q3. </w:t>
-      </w:r>
-      <w:r>
-        <w:t>Année d'agrément au Sénégal (branche vie) :</w:t>
-      </w:r>
-    </w:p>
-    <w:p>
-      <w:r>
-        <w:t>…………………………………………………………………………………………………………………………………………………</w:t>
-      </w:r>
-    </w:p>
-    <w:p>
-      <w:r>
-        <w:rPr>
-          <w:b/>
-        </w:rPr>
-        <w:t xml:space="preserve">Q4. </w:t>
-      </w:r>
-      <w:r>
-        <w:t>Fonction de la personne interrogée (actuaire, souscripteur, directeur technique…) :</w:t>
-      </w:r>
-    </w:p>
-    <w:p>
-      <w:r>
-        <w:t>…………………………………………………………………………………………………………………………………………………</w:t>
-      </w:r>
-    </w:p>
-    <w:p>
-      <w:pPr>
-        <w:spacing w:before="200" w:after="80"/>
-      </w:pPr>
-      <w:r>
-        <w:rPr>
-          <w:b/>
-          <w:sz w:val="26"/>
-        </w:rPr>
-        <w:t>VOLET B — Portefeuille de produits vie</w:t>
-      </w:r>
-    </w:p>
-    <w:p>
-      <w:r>
-        <w:rPr>
-          <w:b/>
-        </w:rPr>
-        <w:t xml:space="preserve">Q5. </w:t>
-      </w:r>
-      <w:r>
-        <w:t>Quels produits d'assurance vie commercialisez-vous ? (cocher)</w:t>
-      </w:r>
-    </w:p>
-    <w:p>
-      <w:r>
-        <w:t>☐  Indemnités de Fin de Carrière (IFC) / passif social entreprises</w:t>
-      </w:r>
-    </w:p>
-    <w:p>
-      <w:r>
-        <w:t>☐  IFC Plus (couverture décès du personnel — indemnités CCNI)</w:t>
-      </w:r>
-    </w:p>
-    <w:p>
-      <w:r>
-        <w:t>☐  Temporaire décès individuelle</w:t>
-      </w:r>
-    </w:p>
-    <w:p>
-      <w:r>
-        <w:t>☐  Assurance décès emprunteur (crédit bancaire)</w:t>
-      </w:r>
-    </w:p>
-    <w:p>
-      <w:r>
-        <w:t>☐  Épargne / capitalisation (capital différé)</w:t>
-      </w:r>
-    </w:p>
-    <w:p>
-      <w:r>
-        <w:t>☐  Retraite complémentaire par capitalisation</w:t>
-      </w:r>
-    </w:p>
-    <w:p>
-      <w:r>
-        <w:t>☐  Rente éducation / rente de conjoint</w:t>
-      </w:r>
-    </w:p>
-    <w:p>
-      <w:r>
-        <w:t>☐  Mixte (épargne + décès)</w:t>
-      </w:r>
-    </w:p>
-    <w:p>
-      <w:r>
-        <w:t>☐  Autre (préciser) : ………………………………</w:t>
-      </w:r>
-    </w:p>
-    <w:p>
-      <w:r>
-        <w:rPr>
-          <w:b/>
-        </w:rPr>
-        <w:t xml:space="preserve">Q6. </w:t>
-      </w:r>
-      <w:r>
-        <w:t>Classez vos trois produits les plus commercialisés par chiffre d'affaires (primes émises) du dernier exercice :</w:t>
-      </w:r>
-    </w:p>
-    <w:p>
-      <w:r>
-        <w:t>…………………………………………………………………………………………………………………………………………………</w:t>
-      </w:r>
-    </w:p>
-    <w:p>
-      <w:r>
-        <w:t>…………………………………………………………………………………………………………………………………………………</w:t>
-      </w:r>
-    </w:p>
-    <w:p>
-      <w:r>
-        <w:t>…………………………………………………………………………………………………………………………………………………</w:t>
-      </w:r>
-    </w:p>
-    <w:p>
-      <w:r>
-        <w:rPr>
-          <w:b/>
-        </w:rPr>
-        <w:t xml:space="preserve">Q7. </w:t>
-      </w:r>
-      <w:r>
-        <w:t>Part approximative du produit n°1 dans les primes vie de la compagnie (%) :</w:t>
-      </w:r>
-    </w:p>
-    <w:p>
-      <w:r>
-        <w:t>…………………………………………………………………………………………………………………………………………………</w:t>
-      </w:r>
-    </w:p>
-    <w:p>
-      <w:r>
-        <w:rPr>
-          <w:b/>
-        </w:rPr>
-        <w:t xml:space="preserve">Q8. </w:t>
-      </w:r>
-      <w:r>
-        <w:t>Quelle clientèle porte ce produit (grandes entreprises, PME, institutions, particuliers) ?</w:t>
-      </w:r>
-    </w:p>
-    <w:p>
-      <w:r>
-        <w:t>…………………………………………………………………………………………………………………………………………………</w:t>
-      </w:r>
-    </w:p>
-    <w:p>
-      <w:pPr>
-        <w:spacing w:before="200" w:after="80"/>
-      </w:pPr>
-      <w:r>
-        <w:rPr>
-          <w:b/>
-          <w:sz w:val="26"/>
-        </w:rPr>
-        <w:t>VOLET C — Caractéristiques techniques du produit le plus commercialisé (IFC)</w:t>
-      </w:r>
-    </w:p>
-    <w:p>
-      <w:r>
-        <w:rPr>
-          <w:b/>
-        </w:rPr>
-        <w:t xml:space="preserve">Q9. </w:t>
-      </w:r>
-      <w:r>
-        <w:t>Quelle convention collective sert de référence au calcul des droits ?</w:t>
-      </w:r>
-    </w:p>
-    <w:p>
-      <w:r>
-        <w:t>…………………………………………………………………………………………………………………………………………………</w:t>
-      </w:r>
-    </w:p>
-    <w:p>
-      <w:r>
-        <w:rPr>
-          <w:b/>
-        </w:rPr>
-        <w:t xml:space="preserve">Q10. </w:t>
-      </w:r>
-      <w:r>
-        <w:t>Quelle table de mortalité utilisez-vous ?  (CIMA H / CIMA F / autre)</w:t>
-      </w:r>
-    </w:p>
-    <w:p>
-      <w:r>
-        <w:t>…………………………………………………………………………………………………………………………………………………</w:t>
-      </w:r>
-    </w:p>
-    <w:p>
-      <w:r>
-        <w:rPr>
-          <w:b/>
-        </w:rPr>
-        <w:t xml:space="preserve">Q11. </w:t>
-      </w:r>
-      <w:r>
-        <w:t>Quel taux technique (taux d'actualisation) appliquez-vous ? (max 3,5 % — art. 338 code CIMA)</w:t>
-      </w:r>
-    </w:p>
-    <w:p>
-      <w:r>
-        <w:t>…………………………………………………………………………………………………………………………………………………</w:t>
-      </w:r>
-    </w:p>
-    <w:p>
-      <w:r>
-        <w:rPr>
-          <w:b/>
-        </w:rPr>
-        <w:t xml:space="preserve">Q12. </w:t>
-      </w:r>
-      <w:r>
-        <w:t>Quel taux d'évolution des salaires retenez-vous par défaut ?</w:t>
-      </w:r>
-    </w:p>
-    <w:p>
-      <w:r>
-        <w:t>…………………………………………………………………………………………………………………………………………………</w:t>
-      </w:r>
-    </w:p>
-    <w:p>
-      <w:r>
-        <w:rPr>
-          <w:b/>
-        </w:rPr>
-        <w:t xml:space="preserve">Q13. </w:t>
-      </w:r>
-      <w:r>
-        <w:t>Quel taux de turn-over (rotation du personnel) retenez-vous par défaut ?</w:t>
-      </w:r>
-    </w:p>
-    <w:p>
-      <w:r>
-        <w:t>…………………………………………………………………………………………………………………………………………………</w:t>
-      </w:r>
-    </w:p>
-    <w:p>
-      <w:r>
-        <w:rPr>
-          <w:b/>
-        </w:rPr>
-        <w:t xml:space="preserve">Q14. </w:t>
-      </w:r>
-      <w:r>
-        <w:t>Quel taux annuel de licenciement retenez-vous par défaut ?</w:t>
-      </w:r>
-    </w:p>
-    <w:p>
-      <w:r>
-        <w:t>…………………………………………………………………………………………………………………………………………………</w:t>
-      </w:r>
-    </w:p>
-    <w:p>
-      <w:r>
-        <w:rPr>
-          <w:b/>
-        </w:rPr>
-        <w:t xml:space="preserve">Q15. </w:t>
-      </w:r>
-      <w:r>
-        <w:t>Quels chargements de gestion appliquez-vous (en % des primes) ?</w:t>
-      </w:r>
-    </w:p>
-    <w:p>
-      <w:r>
-        <w:t>…………………………………………………………………………………………………………………………………………………</w:t>
-      </w:r>
-    </w:p>
-    <w:p>
-      <w:r>
-        <w:rPr>
-          <w:b/>
-        </w:rPr>
-        <w:t xml:space="preserve">Q16. </w:t>
-      </w:r>
-      <w:r>
-        <w:t>Quel âge de départ à la retraite retenez-vous (référence IPRES) ?</w:t>
-      </w:r>
-    </w:p>
-    <w:p>
-      <w:r>
-        <w:t>…………………………………………………………………………………………………………………………………………………</w:t>
-      </w:r>
-    </w:p>
-    <w:p>
-      <w:r>
-        <w:rPr>
-          <w:b/>
-        </w:rPr>
-        <w:t xml:space="preserve">Q17. </w:t>
-      </w:r>
-      <w:r>
-        <w:t>Quelles modalités de financement proposez-vous à l'entreprise (prime unique, dette actuarielle + charge normale, amortissement…) ?</w:t>
-      </w:r>
-    </w:p>
-    <w:p>
-      <w:r>
-        <w:t>…………………………………………………………………………………………………………………………………………………</w:t>
-      </w:r>
-    </w:p>
-    <w:p>
-      <w:r>
-        <w:t>…………………………………………………………………………………………………………………………………………………</w:t>
-      </w:r>
-    </w:p>
-    <w:p>
-      <w:r>
-        <w:rPr>
-          <w:b/>
-        </w:rPr>
-        <w:t xml:space="preserve">Q18. </w:t>
-      </w:r>
-      <w:r>
-        <w:t>Le fonds constitué participe-t-il aux bénéfices financiers et techniques ? À quelles hauteurs ?</w:t>
-      </w:r>
-    </w:p>
-    <w:p>
-      <w:r>
-        <w:t>…………………………………………………………………………………………………………………………………………………</w:t>
-      </w:r>
-    </w:p>
-    <w:p>
-      <w:r>
-        <w:rPr>
-          <w:b/>
-        </w:rPr>
-        <w:t xml:space="preserve">Q19. </w:t>
-      </w:r>
-      <w:r>
-        <w:t>À quelle fréquence recommandez-vous la réactualisation de l'étude actuarielle ?</w:t>
-      </w:r>
-    </w:p>
-    <w:p>
-      <w:r>
-        <w:t>…………………………………………………………………………………………………………………………………………………</w:t>
-      </w:r>
-    </w:p>
-    <w:p>
-      <w:pPr>
-        <w:spacing w:before="200" w:after="80"/>
-      </w:pPr>
-      <w:r>
-        <w:rPr>
-          <w:b/>
-          <w:sz w:val="26"/>
-        </w:rPr>
-        <w:t>VOLET D — Fiche de collecte des données du personnel (entreprise souscriptrice)</w:t>
-      </w:r>
-    </w:p>
-    <w:p>
-      <w:r>
-        <w:t>Cette fiche est remise à l'entreprise souhaitant souscrire le contrat IFC. Les informations ci-dessous sont demandées pour CHAQUE salarié ; elles constituent la base de données utilisée par le simulateur (feuille « BD »).</w:t>
+        <w:t>☐ Face-à-face      ☐ Téléphone      ☐ En ligne</w:t>
       </w:r>
     </w:p>
     <w:tbl>
@@ -481,33 +275,716 @@
         <w:tblLook w:firstColumn="1" w:firstRow="1" w:lastColumn="0" w:lastRow="0" w:noHBand="0" w:noVBand="1" w:val="04A0"/>
       </w:tblPr>
       <w:tblGrid>
-        <w:gridCol w:w="4873"/>
-        <w:gridCol w:w="4873"/>
+        <w:gridCol w:w="9972"/>
       </w:tblGrid>
       <w:tr>
         <w:tc>
           <w:tcPr>
-            <w:tcW w:type="dxa" w:w="4873"/>
+            <w:tcW w:type="dxa" w:w="9972"/>
+            <w:shd w:val="clear" w:fill="F2F2F2"/>
           </w:tcPr>
           <w:p>
+            <w:r/>
             <w:r>
               <w:rPr>
-                <w:sz w:val="20"/>
+                <w:b w:val="0"/>
+                <w:i/>
+                <w:sz w:val="19"/>
               </w:rPr>
-              <w:t>Champ demandé</w:t>
+              <w:t>CONSIGNES DE REMPLISSAGE</w:t>
+              <w:br/>
+              <w:t>☐  cocher la (ou les) case(s) correspondante(s) — questions qualitatives ;</w:t>
+              <w:br/>
+              <w:t>|__|  inscrire un chiffre par case — questions quantitatives ;</w:t>
+              <w:br/>
+              <w:t>………  réponse libre (texte).</w:t>
+              <w:br/>
+              <w:t>Confidentialité : les informations recueillies sont anonymisées et utilisées à des fins strictement pédagogiques.</w:t>
+            </w:r>
+          </w:p>
+        </w:tc>
+      </w:tr>
+    </w:tbl>
+    <w:p/>
+    <w:tbl>
+      <w:tblPr>
+        <w:tblStyle w:val="TableGrid"/>
+        <w:tblW w:type="auto" w:w="0"/>
+        <w:jc w:val="center"/>
+        <w:tblLook w:firstColumn="1" w:firstRow="1" w:lastColumn="0" w:lastRow="0" w:noHBand="0" w:noVBand="1" w:val="04A0"/>
+      </w:tblPr>
+      <w:tblGrid>
+        <w:gridCol w:w="9972"/>
+      </w:tblGrid>
+      <w:tr>
+        <w:tc>
+          <w:tcPr>
+            <w:tcW w:type="dxa" w:w="9972"/>
+            <w:shd w:val="clear" w:fill="404040"/>
+          </w:tcPr>
+          <w:p>
+            <w:r/>
+            <w:r>
+              <w:rPr>
+                <w:b/>
+                <w:i w:val="0"/>
+                <w:color w:val="FFFFFF"/>
+                <w:sz w:val="23"/>
+              </w:rPr>
+              <w:t>VOLET A — IDENTIFICATION DE L'INSTITUTION</w:t>
+            </w:r>
+          </w:p>
+        </w:tc>
+      </w:tr>
+    </w:tbl>
+    <w:p>
+      <w:pPr>
+        <w:spacing w:after="20"/>
+      </w:pPr>
+    </w:p>
+    <w:p>
+      <w:pPr>
+        <w:spacing w:before="120"/>
+      </w:pPr>
+      <w:r>
+        <w:rPr>
+          <w:b/>
+        </w:rPr>
+        <w:t xml:space="preserve">A1. </w:t>
+      </w:r>
+      <w:r>
+        <w:t>Dénomination de la compagnie :</w:t>
+      </w:r>
+      <w:r>
+        <w:rPr>
+          <w:i/>
+          <w:sz w:val="18"/>
+        </w:rPr>
+        <w:t xml:space="preserve">   [réponse libre]</w:t>
+      </w:r>
+    </w:p>
+    <w:p>
+      <w:pPr>
+        <w:spacing w:after="40"/>
+      </w:pPr>
+      <w:r>
+        <w:t>.........................................................................................................</w:t>
+      </w:r>
+    </w:p>
+    <w:p>
+      <w:pPr>
+        <w:spacing w:before="120"/>
+      </w:pPr>
+      <w:r>
+        <w:rPr>
+          <w:b/>
+        </w:rPr>
+        <w:t xml:space="preserve">A2. </w:t>
+      </w:r>
+      <w:r>
+        <w:t>Statut juridique :</w:t>
+      </w:r>
+      <w:r>
+        <w:rPr>
+          <w:i/>
+          <w:sz w:val="18"/>
+        </w:rPr>
+        <w:t xml:space="preserve">   [une seule réponse]</w:t>
+      </w:r>
+    </w:p>
+    <w:tbl>
+      <w:tblPr>
+        <w:tblW w:type="auto" w:w="0"/>
+        <w:tblLook w:firstColumn="1" w:firstRow="1" w:lastColumn="0" w:lastRow="0" w:noHBand="0" w:noVBand="1" w:val="04A0"/>
+      </w:tblPr>
+      <w:tblGrid>
+        <w:gridCol w:w="4986"/>
+        <w:gridCol w:w="4986"/>
+      </w:tblGrid>
+      <w:tr>
+        <w:trPr>
+          <w:trHeight w:val="283"/>
+        </w:trPr>
+        <w:tc>
+          <w:tcPr>
+            <w:tcW w:type="dxa" w:w="4986"/>
+          </w:tcPr>
+          <w:p>
+            <w:r/>
+            <w:r>
+              <w:rPr>
+                <w:b w:val="0"/>
+                <w:i w:val="0"/>
+                <w:sz w:val="21"/>
+              </w:rPr>
+              <w:t>☐  Société anonyme (SA)</w:t>
             </w:r>
           </w:p>
         </w:tc>
         <w:tc>
           <w:tcPr>
-            <w:tcW w:type="dxa" w:w="4873"/>
+            <w:tcW w:type="dxa" w:w="4986"/>
           </w:tcPr>
           <w:p>
+            <w:r/>
             <w:r>
               <w:rPr>
-                <w:sz w:val="20"/>
+                <w:b w:val="0"/>
+                <w:i w:val="0"/>
+                <w:sz w:val="21"/>
               </w:rPr>
-              <w:t>Format / précision</w:t>
+              <w:t>☐  Filiale d'un groupe régional / international</w:t>
+            </w:r>
+          </w:p>
+        </w:tc>
+      </w:tr>
+      <w:tr>
+        <w:trPr>
+          <w:trHeight w:val="283"/>
+        </w:trPr>
+        <w:tc>
+          <w:tcPr>
+            <w:tcW w:type="dxa" w:w="4986"/>
+          </w:tcPr>
+          <w:p>
+            <w:r/>
+            <w:r>
+              <w:rPr>
+                <w:b w:val="0"/>
+                <w:i w:val="0"/>
+                <w:sz w:val="21"/>
+              </w:rPr>
+              <w:t>☐  Mutuelle d'assurance</w:t>
+            </w:r>
+          </w:p>
+        </w:tc>
+        <w:tc>
+          <w:tcPr>
+            <w:tcW w:type="dxa" w:w="4986"/>
+          </w:tcPr>
+          <w:p>
+            <w:r/>
+            <w:r>
+              <w:rPr>
+                <w:b w:val="0"/>
+                <w:i w:val="0"/>
+                <w:sz w:val="21"/>
+              </w:rPr>
+              <w:t>☐  Autre, précisez : ..............................</w:t>
+            </w:r>
+          </w:p>
+        </w:tc>
+      </w:tr>
+    </w:tbl>
+    <w:p>
+      <w:pPr>
+        <w:spacing w:before="120"/>
+      </w:pPr>
+      <w:r>
+        <w:rPr>
+          <w:b/>
+        </w:rPr>
+        <w:t xml:space="preserve">A3. </w:t>
+      </w:r>
+      <w:r>
+        <w:t>Année d'agrément au Sénégal (branche vie) :</w:t>
+      </w:r>
+      <w:r>
+        <w:t xml:space="preserve">      </w:t>
+      </w:r>
+      <w:r>
+        <w:rPr>
+          <w:b/>
+        </w:rPr>
+        <w:t>|__|__|__|__|</w:t>
+      </w:r>
+    </w:p>
+    <w:p>
+      <w:pPr>
+        <w:spacing w:before="120"/>
+      </w:pPr>
+      <w:r>
+        <w:rPr>
+          <w:b/>
+        </w:rPr>
+        <w:t xml:space="preserve">A4. </w:t>
+      </w:r>
+      <w:r>
+        <w:t>Effectif total de la compagnie :</w:t>
+      </w:r>
+      <w:r>
+        <w:t xml:space="preserve">      </w:t>
+      </w:r>
+      <w:r>
+        <w:rPr>
+          <w:b/>
+        </w:rPr>
+        <w:t>|__|__|__|__|</w:t>
+      </w:r>
+      <w:r>
+        <w:t xml:space="preserve">  agents</w:t>
+      </w:r>
+    </w:p>
+    <w:p>
+      <w:pPr>
+        <w:spacing w:before="120"/>
+      </w:pPr>
+      <w:r>
+        <w:rPr>
+          <w:b/>
+        </w:rPr>
+        <w:t xml:space="preserve">A5. </w:t>
+      </w:r>
+      <w:r>
+        <w:t>Fonction de la personne interrogée :</w:t>
+      </w:r>
+      <w:r>
+        <w:rPr>
+          <w:i/>
+          <w:sz w:val="18"/>
+        </w:rPr>
+        <w:t xml:space="preserve">   [une seule réponse]</w:t>
+      </w:r>
+    </w:p>
+    <w:tbl>
+      <w:tblPr>
+        <w:tblW w:type="auto" w:w="0"/>
+        <w:tblLook w:firstColumn="1" w:firstRow="1" w:lastColumn="0" w:lastRow="0" w:noHBand="0" w:noVBand="1" w:val="04A0"/>
+      </w:tblPr>
+      <w:tblGrid>
+        <w:gridCol w:w="4986"/>
+        <w:gridCol w:w="4986"/>
+      </w:tblGrid>
+      <w:tr>
+        <w:trPr>
+          <w:trHeight w:val="283"/>
+        </w:trPr>
+        <w:tc>
+          <w:tcPr>
+            <w:tcW w:type="dxa" w:w="4986"/>
+          </w:tcPr>
+          <w:p>
+            <w:r/>
+            <w:r>
+              <w:rPr>
+                <w:b w:val="0"/>
+                <w:i w:val="0"/>
+                <w:sz w:val="21"/>
+              </w:rPr>
+              <w:t>☐  Actuaire</w:t>
+            </w:r>
+          </w:p>
+        </w:tc>
+        <w:tc>
+          <w:tcPr>
+            <w:tcW w:type="dxa" w:w="4986"/>
+          </w:tcPr>
+          <w:p>
+            <w:r/>
+            <w:r>
+              <w:rPr>
+                <w:b w:val="0"/>
+                <w:i w:val="0"/>
+                <w:sz w:val="21"/>
+              </w:rPr>
+              <w:t>☐  Responsable commercial</w:t>
+            </w:r>
+          </w:p>
+        </w:tc>
+      </w:tr>
+      <w:tr>
+        <w:trPr>
+          <w:trHeight w:val="283"/>
+        </w:trPr>
+        <w:tc>
+          <w:tcPr>
+            <w:tcW w:type="dxa" w:w="4986"/>
+          </w:tcPr>
+          <w:p>
+            <w:r/>
+            <w:r>
+              <w:rPr>
+                <w:b w:val="0"/>
+                <w:i w:val="0"/>
+                <w:sz w:val="21"/>
+              </w:rPr>
+              <w:t>☐  Directeur technique</w:t>
+            </w:r>
+          </w:p>
+        </w:tc>
+        <w:tc>
+          <w:tcPr>
+            <w:tcW w:type="dxa" w:w="4986"/>
+          </w:tcPr>
+          <w:p>
+            <w:r/>
+            <w:r>
+              <w:rPr>
+                <w:b w:val="0"/>
+                <w:i w:val="0"/>
+                <w:sz w:val="21"/>
+              </w:rPr>
+              <w:t>☐  Autre, précisez : ..............................</w:t>
+            </w:r>
+          </w:p>
+        </w:tc>
+      </w:tr>
+      <w:tr>
+        <w:trPr>
+          <w:trHeight w:val="283"/>
+        </w:trPr>
+        <w:tc>
+          <w:tcPr>
+            <w:tcW w:type="dxa" w:w="4986"/>
+          </w:tcPr>
+          <w:p>
+            <w:r/>
+            <w:r>
+              <w:rPr>
+                <w:b w:val="0"/>
+                <w:i w:val="0"/>
+                <w:sz w:val="21"/>
+              </w:rPr>
+              <w:t>☐  Souscripteur vie</w:t>
+            </w:r>
+          </w:p>
+        </w:tc>
+        <w:tc>
+          <w:tcPr>
+            <w:tcW w:type="dxa" w:w="4986"/>
+          </w:tcPr>
+          <w:p/>
+        </w:tc>
+      </w:tr>
+    </w:tbl>
+    <w:tbl>
+      <w:tblPr>
+        <w:tblStyle w:val="TableGrid"/>
+        <w:tblW w:type="auto" w:w="0"/>
+        <w:jc w:val="center"/>
+        <w:tblLook w:firstColumn="1" w:firstRow="1" w:lastColumn="0" w:lastRow="0" w:noHBand="0" w:noVBand="1" w:val="04A0"/>
+      </w:tblPr>
+      <w:tblGrid>
+        <w:gridCol w:w="9972"/>
+      </w:tblGrid>
+      <w:tr>
+        <w:tc>
+          <w:tcPr>
+            <w:tcW w:type="dxa" w:w="9972"/>
+            <w:shd w:val="clear" w:fill="404040"/>
+          </w:tcPr>
+          <w:p>
+            <w:r/>
+            <w:r>
+              <w:rPr>
+                <w:b/>
+                <w:i w:val="0"/>
+                <w:color w:val="FFFFFF"/>
+                <w:sz w:val="23"/>
+              </w:rPr>
+              <w:t>VOLET B — PORTEFEUILLE DE PRODUITS VIE</w:t>
+            </w:r>
+          </w:p>
+        </w:tc>
+      </w:tr>
+    </w:tbl>
+    <w:p>
+      <w:pPr>
+        <w:spacing w:after="20"/>
+      </w:pPr>
+    </w:p>
+    <w:p>
+      <w:pPr>
+        <w:spacing w:before="120"/>
+      </w:pPr>
+      <w:r>
+        <w:rPr>
+          <w:b/>
+        </w:rPr>
+        <w:t xml:space="preserve">B1. </w:t>
+      </w:r>
+      <w:r>
+        <w:t>Quels produits d'assurance vie commercialisez-vous ?</w:t>
+      </w:r>
+      <w:r>
+        <w:rPr>
+          <w:i/>
+          <w:sz w:val="18"/>
+        </w:rPr>
+        <w:t xml:space="preserve">   [plusieurs réponses possibles]</w:t>
+      </w:r>
+    </w:p>
+    <w:tbl>
+      <w:tblPr>
+        <w:tblW w:type="auto" w:w="0"/>
+        <w:tblLook w:firstColumn="1" w:firstRow="1" w:lastColumn="0" w:lastRow="0" w:noHBand="0" w:noVBand="1" w:val="04A0"/>
+      </w:tblPr>
+      <w:tblGrid>
+        <w:gridCol w:w="4986"/>
+        <w:gridCol w:w="4986"/>
+      </w:tblGrid>
+      <w:tr>
+        <w:trPr>
+          <w:trHeight w:val="283"/>
+        </w:trPr>
+        <w:tc>
+          <w:tcPr>
+            <w:tcW w:type="dxa" w:w="4986"/>
+          </w:tcPr>
+          <w:p>
+            <w:r/>
+            <w:r>
+              <w:rPr>
+                <w:b w:val="0"/>
+                <w:i w:val="0"/>
+                <w:sz w:val="21"/>
+              </w:rPr>
+              <w:t>☐  Indemnités de Fin de Carrière (IFC)</w:t>
+            </w:r>
+          </w:p>
+        </w:tc>
+        <w:tc>
+          <w:tcPr>
+            <w:tcW w:type="dxa" w:w="4986"/>
+          </w:tcPr>
+          <w:p>
+            <w:r/>
+            <w:r>
+              <w:rPr>
+                <w:b w:val="0"/>
+                <w:i w:val="0"/>
+                <w:sz w:val="21"/>
+              </w:rPr>
+              <w:t>☐  Retraite complémentaire</w:t>
+            </w:r>
+          </w:p>
+        </w:tc>
+      </w:tr>
+      <w:tr>
+        <w:trPr>
+          <w:trHeight w:val="283"/>
+        </w:trPr>
+        <w:tc>
+          <w:tcPr>
+            <w:tcW w:type="dxa" w:w="4986"/>
+          </w:tcPr>
+          <w:p>
+            <w:r/>
+            <w:r>
+              <w:rPr>
+                <w:b w:val="0"/>
+                <w:i w:val="0"/>
+                <w:sz w:val="21"/>
+              </w:rPr>
+              <w:t>☐  IFC Plus (décès du personnel — CCNI)</w:t>
+            </w:r>
+          </w:p>
+        </w:tc>
+        <w:tc>
+          <w:tcPr>
+            <w:tcW w:type="dxa" w:w="4986"/>
+          </w:tcPr>
+          <w:p>
+            <w:r/>
+            <w:r>
+              <w:rPr>
+                <w:b w:val="0"/>
+                <w:i w:val="0"/>
+                <w:sz w:val="21"/>
+              </w:rPr>
+              <w:t>☐  Rente éducation / rente de conjoint</w:t>
+            </w:r>
+          </w:p>
+        </w:tc>
+      </w:tr>
+      <w:tr>
+        <w:trPr>
+          <w:trHeight w:val="283"/>
+        </w:trPr>
+        <w:tc>
+          <w:tcPr>
+            <w:tcW w:type="dxa" w:w="4986"/>
+          </w:tcPr>
+          <w:p>
+            <w:r/>
+            <w:r>
+              <w:rPr>
+                <w:b w:val="0"/>
+                <w:i w:val="0"/>
+                <w:sz w:val="21"/>
+              </w:rPr>
+              <w:t>☐  Temporaire décès individuelle</w:t>
+            </w:r>
+          </w:p>
+        </w:tc>
+        <w:tc>
+          <w:tcPr>
+            <w:tcW w:type="dxa" w:w="4986"/>
+          </w:tcPr>
+          <w:p>
+            <w:r/>
+            <w:r>
+              <w:rPr>
+                <w:b w:val="0"/>
+                <w:i w:val="0"/>
+                <w:sz w:val="21"/>
+              </w:rPr>
+              <w:t>☐  Mixte (épargne + décès)</w:t>
+            </w:r>
+          </w:p>
+        </w:tc>
+      </w:tr>
+      <w:tr>
+        <w:trPr>
+          <w:trHeight w:val="283"/>
+        </w:trPr>
+        <w:tc>
+          <w:tcPr>
+            <w:tcW w:type="dxa" w:w="4986"/>
+          </w:tcPr>
+          <w:p>
+            <w:r/>
+            <w:r>
+              <w:rPr>
+                <w:b w:val="0"/>
+                <w:i w:val="0"/>
+                <w:sz w:val="21"/>
+              </w:rPr>
+              <w:t>☐  Décès emprunteur (crédit bancaire)</w:t>
+            </w:r>
+          </w:p>
+        </w:tc>
+        <w:tc>
+          <w:tcPr>
+            <w:tcW w:type="dxa" w:w="4986"/>
+          </w:tcPr>
+          <w:p>
+            <w:r/>
+            <w:r>
+              <w:rPr>
+                <w:b w:val="0"/>
+                <w:i w:val="0"/>
+                <w:sz w:val="21"/>
+              </w:rPr>
+              <w:t>☐  Autre, précisez : ..............................</w:t>
+            </w:r>
+          </w:p>
+        </w:tc>
+      </w:tr>
+      <w:tr>
+        <w:trPr>
+          <w:trHeight w:val="283"/>
+        </w:trPr>
+        <w:tc>
+          <w:tcPr>
+            <w:tcW w:type="dxa" w:w="4986"/>
+          </w:tcPr>
+          <w:p>
+            <w:r/>
+            <w:r>
+              <w:rPr>
+                <w:b w:val="0"/>
+                <w:i w:val="0"/>
+                <w:sz w:val="21"/>
+              </w:rPr>
+              <w:t>☐  Épargne / capitalisation</w:t>
+            </w:r>
+          </w:p>
+        </w:tc>
+        <w:tc>
+          <w:tcPr>
+            <w:tcW w:type="dxa" w:w="4986"/>
+          </w:tcPr>
+          <w:p/>
+        </w:tc>
+      </w:tr>
+    </w:tbl>
+    <w:p>
+      <w:pPr>
+        <w:spacing w:before="120"/>
+      </w:pPr>
+      <w:r>
+        <w:rPr>
+          <w:b/>
+        </w:rPr>
+        <w:t xml:space="preserve">B2. </w:t>
+      </w:r>
+      <w:r>
+        <w:t>Classez vos trois produits les plus commercialisés (exercice 2025) :</w:t>
+      </w:r>
+    </w:p>
+    <w:tbl>
+      <w:tblPr>
+        <w:tblStyle w:val="TableGrid"/>
+        <w:tblW w:type="auto" w:w="0"/>
+        <w:tblLook w:firstColumn="1" w:firstRow="1" w:lastColumn="0" w:lastRow="0" w:noHBand="0" w:noVBand="1" w:val="04A0"/>
+      </w:tblPr>
+      <w:tblGrid>
+        <w:gridCol w:w="1020"/>
+        <w:gridCol w:w="4819"/>
+        <w:gridCol w:w="3515"/>
+      </w:tblGrid>
+      <w:tr>
+        <w:trPr>
+          <w:tblHeader w:val="true"/>
+        </w:trPr>
+        <w:tc>
+          <w:tcPr>
+            <w:tcW w:type="dxa" w:w="3324"/>
+            <w:shd w:val="clear" w:fill="D9D9D9"/>
+          </w:tcPr>
+          <w:p>
+            <w:pPr>
+              <w:jc w:val="center"/>
+            </w:pPr>
+            <w:r/>
+            <w:r>
+              <w:rPr>
+                <w:b/>
+                <w:i w:val="0"/>
+                <w:sz w:val="19"/>
+              </w:rPr>
+              <w:t>Rang</w:t>
+            </w:r>
+          </w:p>
+        </w:tc>
+        <w:tc>
+          <w:tcPr>
+            <w:tcW w:type="dxa" w:w="3324"/>
+            <w:shd w:val="clear" w:fill="D9D9D9"/>
+          </w:tcPr>
+          <w:p>
+            <w:pPr>
+              <w:jc w:val="center"/>
+            </w:pPr>
+            <w:r/>
+            <w:r>
+              <w:rPr>
+                <w:b/>
+                <w:i w:val="0"/>
+                <w:sz w:val="19"/>
+              </w:rPr>
+              <w:t>Produit</w:t>
+            </w:r>
+          </w:p>
+        </w:tc>
+        <w:tc>
+          <w:tcPr>
+            <w:tcW w:type="dxa" w:w="3324"/>
+            <w:shd w:val="clear" w:fill="D9D9D9"/>
+          </w:tcPr>
+          <w:p>
+            <w:pPr>
+              <w:jc w:val="center"/>
+            </w:pPr>
+            <w:r/>
+            <w:r>
+              <w:rPr>
+                <w:b/>
+                <w:i w:val="0"/>
+                <w:sz w:val="19"/>
+              </w:rPr>
+              <w:t>Primes émises 2025 (FCFA)</w:t>
             </w:r>
           </w:p>
         </w:tc>
@@ -515,12 +992,1372 @@
       <w:tr>
         <w:tc>
           <w:tcPr>
-            <w:tcW w:type="dxa" w:w="4873"/>
+            <w:tcW w:type="dxa" w:w="3324"/>
           </w:tcPr>
           <w:p>
+            <w:pPr>
+              <w:jc w:val="center"/>
+            </w:pPr>
+            <w:r/>
             <w:r>
               <w:rPr>
+                <w:b w:val="0"/>
+                <w:i w:val="0"/>
                 <w:sz w:val="20"/>
+              </w:rPr>
+              <w:t>n°1</w:t>
+            </w:r>
+          </w:p>
+        </w:tc>
+        <w:tc>
+          <w:tcPr>
+            <w:tcW w:type="dxa" w:w="3324"/>
+          </w:tcPr>
+          <w:p/>
+        </w:tc>
+        <w:tc>
+          <w:tcPr>
+            <w:tcW w:type="dxa" w:w="3324"/>
+          </w:tcPr>
+          <w:p>
+            <w:pPr>
+              <w:jc w:val="center"/>
+            </w:pPr>
+            <w:r/>
+            <w:r>
+              <w:rPr>
+                <w:b w:val="0"/>
+                <w:i w:val="0"/>
+                <w:sz w:val="20"/>
+              </w:rPr>
+              <w:t>|__|__|__|__|__|__|__|__|__|__|__|__|</w:t>
+            </w:r>
+          </w:p>
+        </w:tc>
+      </w:tr>
+      <w:tr>
+        <w:tc>
+          <w:tcPr>
+            <w:tcW w:type="dxa" w:w="3324"/>
+          </w:tcPr>
+          <w:p>
+            <w:pPr>
+              <w:jc w:val="center"/>
+            </w:pPr>
+            <w:r/>
+            <w:r>
+              <w:rPr>
+                <w:b w:val="0"/>
+                <w:i w:val="0"/>
+                <w:sz w:val="20"/>
+              </w:rPr>
+              <w:t>n°2</w:t>
+            </w:r>
+          </w:p>
+        </w:tc>
+        <w:tc>
+          <w:tcPr>
+            <w:tcW w:type="dxa" w:w="3324"/>
+          </w:tcPr>
+          <w:p/>
+        </w:tc>
+        <w:tc>
+          <w:tcPr>
+            <w:tcW w:type="dxa" w:w="3324"/>
+          </w:tcPr>
+          <w:p>
+            <w:pPr>
+              <w:jc w:val="center"/>
+            </w:pPr>
+            <w:r/>
+            <w:r>
+              <w:rPr>
+                <w:b w:val="0"/>
+                <w:i w:val="0"/>
+                <w:sz w:val="20"/>
+              </w:rPr>
+              <w:t>|__|__|__|__|__|__|__|__|__|__|__|__|</w:t>
+            </w:r>
+          </w:p>
+        </w:tc>
+      </w:tr>
+      <w:tr>
+        <w:tc>
+          <w:tcPr>
+            <w:tcW w:type="dxa" w:w="3324"/>
+          </w:tcPr>
+          <w:p>
+            <w:pPr>
+              <w:jc w:val="center"/>
+            </w:pPr>
+            <w:r/>
+            <w:r>
+              <w:rPr>
+                <w:b w:val="0"/>
+                <w:i w:val="0"/>
+                <w:sz w:val="20"/>
+              </w:rPr>
+              <w:t>n°3</w:t>
+            </w:r>
+          </w:p>
+        </w:tc>
+        <w:tc>
+          <w:tcPr>
+            <w:tcW w:type="dxa" w:w="3324"/>
+          </w:tcPr>
+          <w:p/>
+        </w:tc>
+        <w:tc>
+          <w:tcPr>
+            <w:tcW w:type="dxa" w:w="3324"/>
+          </w:tcPr>
+          <w:p>
+            <w:pPr>
+              <w:jc w:val="center"/>
+            </w:pPr>
+            <w:r/>
+            <w:r>
+              <w:rPr>
+                <w:b w:val="0"/>
+                <w:i w:val="0"/>
+                <w:sz w:val="20"/>
+              </w:rPr>
+              <w:t>|__|__|__|__|__|__|__|__|__|__|__|__|</w:t>
+            </w:r>
+          </w:p>
+        </w:tc>
+      </w:tr>
+    </w:tbl>
+    <w:p>
+      <w:pPr>
+        <w:spacing w:before="120"/>
+      </w:pPr>
+      <w:r>
+        <w:rPr>
+          <w:b/>
+        </w:rPr>
+        <w:t xml:space="preserve">B3. </w:t>
+      </w:r>
+      <w:r>
+        <w:t>Part du produit n°1 dans les primes vie de la compagnie :</w:t>
+      </w:r>
+      <w:r>
+        <w:t xml:space="preserve">      </w:t>
+      </w:r>
+      <w:r>
+        <w:rPr>
+          <w:b/>
+        </w:rPr>
+        <w:t>|__|__|,__|</w:t>
+      </w:r>
+      <w:r>
+        <w:t xml:space="preserve">  %</w:t>
+      </w:r>
+    </w:p>
+    <w:p>
+      <w:pPr>
+        <w:spacing w:before="120"/>
+      </w:pPr>
+      <w:r>
+        <w:rPr>
+          <w:b/>
+        </w:rPr>
+        <w:t xml:space="preserve">B4. </w:t>
+      </w:r>
+      <w:r>
+        <w:t>Nombre de contrats du produit n°1 en portefeuille :</w:t>
+      </w:r>
+      <w:r>
+        <w:t xml:space="preserve">      </w:t>
+      </w:r>
+      <w:r>
+        <w:rPr>
+          <w:b/>
+        </w:rPr>
+        <w:t>|__|__|__|__|__|</w:t>
+      </w:r>
+    </w:p>
+    <w:p>
+      <w:pPr>
+        <w:spacing w:before="120"/>
+      </w:pPr>
+      <w:r>
+        <w:rPr>
+          <w:b/>
+        </w:rPr>
+        <w:t xml:space="preserve">B5. </w:t>
+      </w:r>
+      <w:r>
+        <w:t>Quelle clientèle porte principalement ce produit ?</w:t>
+      </w:r>
+      <w:r>
+        <w:rPr>
+          <w:i/>
+          <w:sz w:val="18"/>
+        </w:rPr>
+        <w:t xml:space="preserve">   [plusieurs réponses possibles]</w:t>
+      </w:r>
+    </w:p>
+    <w:tbl>
+      <w:tblPr>
+        <w:tblW w:type="auto" w:w="0"/>
+        <w:tblLook w:firstColumn="1" w:firstRow="1" w:lastColumn="0" w:lastRow="0" w:noHBand="0" w:noVBand="1" w:val="04A0"/>
+      </w:tblPr>
+      <w:tblGrid>
+        <w:gridCol w:w="4986"/>
+        <w:gridCol w:w="4986"/>
+      </w:tblGrid>
+      <w:tr>
+        <w:trPr>
+          <w:trHeight w:val="283"/>
+        </w:trPr>
+        <w:tc>
+          <w:tcPr>
+            <w:tcW w:type="dxa" w:w="4986"/>
+          </w:tcPr>
+          <w:p>
+            <w:r/>
+            <w:r>
+              <w:rPr>
+                <w:b w:val="0"/>
+                <w:i w:val="0"/>
+                <w:sz w:val="21"/>
+              </w:rPr>
+              <w:t>☐  Grandes entreprises</w:t>
+            </w:r>
+          </w:p>
+        </w:tc>
+        <w:tc>
+          <w:tcPr>
+            <w:tcW w:type="dxa" w:w="4986"/>
+          </w:tcPr>
+          <w:p>
+            <w:r/>
+            <w:r>
+              <w:rPr>
+                <w:b w:val="0"/>
+                <w:i w:val="0"/>
+                <w:sz w:val="21"/>
+              </w:rPr>
+              <w:t>☐  Institutions publiques</w:t>
+            </w:r>
+          </w:p>
+        </w:tc>
+      </w:tr>
+      <w:tr>
+        <w:trPr>
+          <w:trHeight w:val="283"/>
+        </w:trPr>
+        <w:tc>
+          <w:tcPr>
+            <w:tcW w:type="dxa" w:w="4986"/>
+          </w:tcPr>
+          <w:p>
+            <w:r/>
+            <w:r>
+              <w:rPr>
+                <w:b w:val="0"/>
+                <w:i w:val="0"/>
+                <w:sz w:val="21"/>
+              </w:rPr>
+              <w:t>☐  PME / PMI</w:t>
+            </w:r>
+          </w:p>
+        </w:tc>
+        <w:tc>
+          <w:tcPr>
+            <w:tcW w:type="dxa" w:w="4986"/>
+          </w:tcPr>
+          <w:p>
+            <w:r/>
+            <w:r>
+              <w:rPr>
+                <w:b w:val="0"/>
+                <w:i w:val="0"/>
+                <w:sz w:val="21"/>
+              </w:rPr>
+              <w:t>☐  Particuliers</w:t>
+            </w:r>
+          </w:p>
+        </w:tc>
+      </w:tr>
+    </w:tbl>
+    <w:tbl>
+      <w:tblPr>
+        <w:tblStyle w:val="TableGrid"/>
+        <w:tblW w:type="auto" w:w="0"/>
+        <w:jc w:val="center"/>
+        <w:tblLook w:firstColumn="1" w:firstRow="1" w:lastColumn="0" w:lastRow="0" w:noHBand="0" w:noVBand="1" w:val="04A0"/>
+      </w:tblPr>
+      <w:tblGrid>
+        <w:gridCol w:w="9972"/>
+      </w:tblGrid>
+      <w:tr>
+        <w:tc>
+          <w:tcPr>
+            <w:tcW w:type="dxa" w:w="9972"/>
+            <w:shd w:val="clear" w:fill="404040"/>
+          </w:tcPr>
+          <w:p>
+            <w:r/>
+            <w:r>
+              <w:rPr>
+                <w:b/>
+                <w:i w:val="0"/>
+                <w:color w:val="FFFFFF"/>
+                <w:sz w:val="23"/>
+              </w:rPr>
+              <w:t>VOLET C — CARACTÉRISTIQUES TECHNIQUES DU PRODUIT LE PLUS COMMERCIALISÉ</w:t>
+            </w:r>
+          </w:p>
+        </w:tc>
+      </w:tr>
+    </w:tbl>
+    <w:p>
+      <w:pPr>
+        <w:spacing w:after="20"/>
+      </w:pPr>
+    </w:p>
+    <w:p>
+      <w:pPr>
+        <w:spacing w:before="120"/>
+      </w:pPr>
+      <w:r>
+        <w:rPr>
+          <w:b/>
+        </w:rPr>
+        <w:t xml:space="preserve">C1. </w:t>
+      </w:r>
+      <w:r>
+        <w:t>Convention de référence pour le calcul des droits :</w:t>
+      </w:r>
+      <w:r>
+        <w:rPr>
+          <w:i/>
+          <w:sz w:val="18"/>
+        </w:rPr>
+        <w:t xml:space="preserve">   [une seule réponse]</w:t>
+      </w:r>
+    </w:p>
+    <w:tbl>
+      <w:tblPr>
+        <w:tblW w:type="auto" w:w="0"/>
+        <w:tblLook w:firstColumn="1" w:firstRow="1" w:lastColumn="0" w:lastRow="0" w:noHBand="0" w:noVBand="1" w:val="04A0"/>
+      </w:tblPr>
+      <w:tblGrid>
+        <w:gridCol w:w="9972"/>
+      </w:tblGrid>
+      <w:tr>
+        <w:trPr>
+          <w:trHeight w:val="283"/>
+        </w:trPr>
+        <w:tc>
+          <w:tcPr>
+            <w:tcW w:type="dxa" w:w="9972"/>
+          </w:tcPr>
+          <w:p>
+            <w:r/>
+            <w:r>
+              <w:rPr>
+                <w:b w:val="0"/>
+                <w:i w:val="0"/>
+                <w:sz w:val="21"/>
+              </w:rPr>
+              <w:t>☐  Convention Collective Nationale Interprofessionnelle (CCNI)</w:t>
+            </w:r>
+          </w:p>
+        </w:tc>
+      </w:tr>
+      <w:tr>
+        <w:trPr>
+          <w:trHeight w:val="283"/>
+        </w:trPr>
+        <w:tc>
+          <w:tcPr>
+            <w:tcW w:type="dxa" w:w="9972"/>
+          </w:tcPr>
+          <w:p>
+            <w:r/>
+            <w:r>
+              <w:rPr>
+                <w:b w:val="0"/>
+                <w:i w:val="0"/>
+                <w:sz w:val="21"/>
+              </w:rPr>
+              <w:t>☐  Convention collective sectorielle</w:t>
+            </w:r>
+          </w:p>
+        </w:tc>
+      </w:tr>
+      <w:tr>
+        <w:trPr>
+          <w:trHeight w:val="283"/>
+        </w:trPr>
+        <w:tc>
+          <w:tcPr>
+            <w:tcW w:type="dxa" w:w="9972"/>
+          </w:tcPr>
+          <w:p>
+            <w:r/>
+            <w:r>
+              <w:rPr>
+                <w:b w:val="0"/>
+                <w:i w:val="0"/>
+                <w:sz w:val="21"/>
+              </w:rPr>
+              <w:t>☐  Autre, précisez : ..............................</w:t>
+            </w:r>
+          </w:p>
+        </w:tc>
+      </w:tr>
+    </w:tbl>
+    <w:p>
+      <w:pPr>
+        <w:spacing w:before="120"/>
+      </w:pPr>
+      <w:r>
+        <w:rPr>
+          <w:b/>
+        </w:rPr>
+        <w:t xml:space="preserve">C2. </w:t>
+      </w:r>
+      <w:r>
+        <w:t>Table de mortalité utilisée :</w:t>
+      </w:r>
+      <w:r>
+        <w:rPr>
+          <w:i/>
+          <w:sz w:val="18"/>
+        </w:rPr>
+        <w:t xml:space="preserve">   [une seule réponse]</w:t>
+      </w:r>
+    </w:p>
+    <w:tbl>
+      <w:tblPr>
+        <w:tblW w:type="auto" w:w="0"/>
+        <w:tblLook w:firstColumn="1" w:firstRow="1" w:lastColumn="0" w:lastRow="0" w:noHBand="0" w:noVBand="1" w:val="04A0"/>
+      </w:tblPr>
+      <w:tblGrid>
+        <w:gridCol w:w="4986"/>
+        <w:gridCol w:w="4986"/>
+      </w:tblGrid>
+      <w:tr>
+        <w:trPr>
+          <w:trHeight w:val="283"/>
+        </w:trPr>
+        <w:tc>
+          <w:tcPr>
+            <w:tcW w:type="dxa" w:w="4986"/>
+          </w:tcPr>
+          <w:p>
+            <w:r/>
+            <w:r>
+              <w:rPr>
+                <w:b w:val="0"/>
+                <w:i w:val="0"/>
+                <w:sz w:val="21"/>
+              </w:rPr>
+              <w:t>☐  CIMA H</w:t>
+            </w:r>
+          </w:p>
+        </w:tc>
+        <w:tc>
+          <w:tcPr>
+            <w:tcW w:type="dxa" w:w="4986"/>
+          </w:tcPr>
+          <w:p>
+            <w:r/>
+            <w:r>
+              <w:rPr>
+                <w:b w:val="0"/>
+                <w:i w:val="0"/>
+                <w:sz w:val="21"/>
+              </w:rPr>
+              <w:t>☐  Table d'expérience</w:t>
+            </w:r>
+          </w:p>
+        </w:tc>
+      </w:tr>
+      <w:tr>
+        <w:trPr>
+          <w:trHeight w:val="283"/>
+        </w:trPr>
+        <w:tc>
+          <w:tcPr>
+            <w:tcW w:type="dxa" w:w="4986"/>
+          </w:tcPr>
+          <w:p>
+            <w:r/>
+            <w:r>
+              <w:rPr>
+                <w:b w:val="0"/>
+                <w:i w:val="0"/>
+                <w:sz w:val="21"/>
+              </w:rPr>
+              <w:t>☐  CIMA F</w:t>
+            </w:r>
+          </w:p>
+        </w:tc>
+        <w:tc>
+          <w:tcPr>
+            <w:tcW w:type="dxa" w:w="4986"/>
+          </w:tcPr>
+          <w:p>
+            <w:r/>
+            <w:r>
+              <w:rPr>
+                <w:b w:val="0"/>
+                <w:i w:val="0"/>
+                <w:sz w:val="21"/>
+              </w:rPr>
+              <w:t>☐  Autre, précisez : ..............................</w:t>
+            </w:r>
+          </w:p>
+        </w:tc>
+      </w:tr>
+    </w:tbl>
+    <w:p>
+      <w:pPr>
+        <w:spacing w:before="120"/>
+      </w:pPr>
+      <w:r>
+        <w:rPr>
+          <w:b/>
+        </w:rPr>
+        <w:t xml:space="preserve">C3. </w:t>
+      </w:r>
+      <w:r>
+        <w:t>Taux technique (max 3,5 % — art. 338 code CIMA) :</w:t>
+      </w:r>
+      <w:r>
+        <w:t xml:space="preserve">      </w:t>
+      </w:r>
+      <w:r>
+        <w:rPr>
+          <w:b/>
+        </w:rPr>
+        <w:t>|__|,__|__|</w:t>
+      </w:r>
+      <w:r>
+        <w:t xml:space="preserve">  %</w:t>
+      </w:r>
+    </w:p>
+    <w:p>
+      <w:pPr>
+        <w:spacing w:before="120"/>
+      </w:pPr>
+      <w:r>
+        <w:rPr>
+          <w:b/>
+        </w:rPr>
+        <w:t xml:space="preserve">C4. </w:t>
+      </w:r>
+      <w:r>
+        <w:t>Taux d'évolution des salaires (par défaut) :</w:t>
+      </w:r>
+      <w:r>
+        <w:t xml:space="preserve">      </w:t>
+      </w:r>
+      <w:r>
+        <w:rPr>
+          <w:b/>
+        </w:rPr>
+        <w:t>|__|,__|__|</w:t>
+      </w:r>
+      <w:r>
+        <w:t xml:space="preserve">  %</w:t>
+      </w:r>
+    </w:p>
+    <w:p>
+      <w:pPr>
+        <w:spacing w:before="120"/>
+      </w:pPr>
+      <w:r>
+        <w:rPr>
+          <w:b/>
+        </w:rPr>
+        <w:t xml:space="preserve">C5. </w:t>
+      </w:r>
+      <w:r>
+        <w:t>Taux de turn-over (par défaut) :</w:t>
+      </w:r>
+      <w:r>
+        <w:t xml:space="preserve">      </w:t>
+      </w:r>
+      <w:r>
+        <w:rPr>
+          <w:b/>
+        </w:rPr>
+        <w:t>|__|,__|__|</w:t>
+      </w:r>
+      <w:r>
+        <w:t xml:space="preserve">  %</w:t>
+      </w:r>
+    </w:p>
+    <w:p>
+      <w:pPr>
+        <w:spacing w:before="120"/>
+      </w:pPr>
+      <w:r>
+        <w:rPr>
+          <w:b/>
+        </w:rPr>
+        <w:t xml:space="preserve">C6. </w:t>
+      </w:r>
+      <w:r>
+        <w:t>Taux annuel de licenciement (par défaut) :</w:t>
+      </w:r>
+      <w:r>
+        <w:t xml:space="preserve">      </w:t>
+      </w:r>
+      <w:r>
+        <w:rPr>
+          <w:b/>
+        </w:rPr>
+        <w:t>|__|,__|__|</w:t>
+      </w:r>
+      <w:r>
+        <w:t xml:space="preserve">  %</w:t>
+      </w:r>
+    </w:p>
+    <w:p>
+      <w:pPr>
+        <w:spacing w:before="120"/>
+      </w:pPr>
+      <w:r>
+        <w:rPr>
+          <w:b/>
+        </w:rPr>
+        <w:t xml:space="preserve">C7. </w:t>
+      </w:r>
+      <w:r>
+        <w:t>Chargements de gestion (en % des primes) :</w:t>
+      </w:r>
+      <w:r>
+        <w:t xml:space="preserve">      </w:t>
+      </w:r>
+      <w:r>
+        <w:rPr>
+          <w:b/>
+        </w:rPr>
+        <w:t>|__|__|,__|</w:t>
+      </w:r>
+      <w:r>
+        <w:t xml:space="preserve">  %</w:t>
+      </w:r>
+    </w:p>
+    <w:p>
+      <w:pPr>
+        <w:spacing w:before="120"/>
+      </w:pPr>
+      <w:r>
+        <w:rPr>
+          <w:b/>
+        </w:rPr>
+        <w:t xml:space="preserve">C8. </w:t>
+      </w:r>
+      <w:r>
+        <w:t>Âge de départ à la retraite retenu (référence IPRES) :</w:t>
+      </w:r>
+      <w:r>
+        <w:t xml:space="preserve">      </w:t>
+      </w:r>
+      <w:r>
+        <w:rPr>
+          <w:b/>
+        </w:rPr>
+        <w:t>|__|__|</w:t>
+      </w:r>
+      <w:r>
+        <w:t xml:space="preserve">  ans</w:t>
+      </w:r>
+    </w:p>
+    <w:p>
+      <w:pPr>
+        <w:spacing w:before="120"/>
+      </w:pPr>
+      <w:r>
+        <w:rPr>
+          <w:b/>
+        </w:rPr>
+        <w:t xml:space="preserve">C9. </w:t>
+      </w:r>
+      <w:r>
+        <w:t>Modalités de financement proposées à l'entreprise :</w:t>
+      </w:r>
+      <w:r>
+        <w:rPr>
+          <w:i/>
+          <w:sz w:val="18"/>
+        </w:rPr>
+        <w:t xml:space="preserve">   [plusieurs réponses possibles]</w:t>
+      </w:r>
+    </w:p>
+    <w:tbl>
+      <w:tblPr>
+        <w:tblW w:type="auto" w:w="0"/>
+        <w:tblLook w:firstColumn="1" w:firstRow="1" w:lastColumn="0" w:lastRow="0" w:noHBand="0" w:noVBand="1" w:val="04A0"/>
+      </w:tblPr>
+      <w:tblGrid>
+        <w:gridCol w:w="9972"/>
+      </w:tblGrid>
+      <w:tr>
+        <w:trPr>
+          <w:trHeight w:val="283"/>
+        </w:trPr>
+        <w:tc>
+          <w:tcPr>
+            <w:tcW w:type="dxa" w:w="9972"/>
+          </w:tcPr>
+          <w:p>
+            <w:r/>
+            <w:r>
+              <w:rPr>
+                <w:b w:val="0"/>
+                <w:i w:val="0"/>
+                <w:sz w:val="21"/>
+              </w:rPr>
+              <w:t>☐  Prime unique (engagement global)</w:t>
+            </w:r>
+          </w:p>
+        </w:tc>
+      </w:tr>
+      <w:tr>
+        <w:trPr>
+          <w:trHeight w:val="283"/>
+        </w:trPr>
+        <w:tc>
+          <w:tcPr>
+            <w:tcW w:type="dxa" w:w="9972"/>
+          </w:tcPr>
+          <w:p>
+            <w:r/>
+            <w:r>
+              <w:rPr>
+                <w:b w:val="0"/>
+                <w:i w:val="0"/>
+                <w:sz w:val="21"/>
+              </w:rPr>
+              <w:t>☐  Dette actuarielle + charge normale annuelle</w:t>
+            </w:r>
+          </w:p>
+        </w:tc>
+      </w:tr>
+      <w:tr>
+        <w:trPr>
+          <w:trHeight w:val="283"/>
+        </w:trPr>
+        <w:tc>
+          <w:tcPr>
+            <w:tcW w:type="dxa" w:w="9972"/>
+          </w:tcPr>
+          <w:p>
+            <w:r/>
+            <w:r>
+              <w:rPr>
+                <w:b w:val="0"/>
+                <w:i w:val="0"/>
+                <w:sz w:val="21"/>
+              </w:rPr>
+              <w:t>☐  Amortissement de la dette sur N exercices</w:t>
+            </w:r>
+          </w:p>
+        </w:tc>
+      </w:tr>
+      <w:tr>
+        <w:trPr>
+          <w:trHeight w:val="283"/>
+        </w:trPr>
+        <w:tc>
+          <w:tcPr>
+            <w:tcW w:type="dxa" w:w="9972"/>
+          </w:tcPr>
+          <w:p>
+            <w:r/>
+            <w:r>
+              <w:rPr>
+                <w:b w:val="0"/>
+                <w:i w:val="0"/>
+                <w:sz w:val="21"/>
+              </w:rPr>
+              <w:t>☐  Versements libres</w:t>
+            </w:r>
+          </w:p>
+        </w:tc>
+      </w:tr>
+    </w:tbl>
+    <w:p>
+      <w:pPr>
+        <w:spacing w:before="120"/>
+      </w:pPr>
+      <w:r>
+        <w:rPr>
+          <w:b/>
+        </w:rPr>
+        <w:t xml:space="preserve">C9bis. </w:t>
+      </w:r>
+      <w:r>
+        <w:t>Si amortissement : durée proposée :</w:t>
+      </w:r>
+      <w:r>
+        <w:t xml:space="preserve">      </w:t>
+      </w:r>
+      <w:r>
+        <w:rPr>
+          <w:b/>
+        </w:rPr>
+        <w:t>|__|__|</w:t>
+      </w:r>
+      <w:r>
+        <w:t xml:space="preserve">  ans</w:t>
+      </w:r>
+    </w:p>
+    <w:p>
+      <w:pPr>
+        <w:spacing w:before="120"/>
+      </w:pPr>
+      <w:r>
+        <w:rPr>
+          <w:b/>
+        </w:rPr>
+        <w:t xml:space="preserve">C10. </w:t>
+      </w:r>
+      <w:r>
+        <w:t>Le fonds participe-t-il aux bénéfices ?</w:t>
+      </w:r>
+      <w:r>
+        <w:rPr>
+          <w:i/>
+          <w:sz w:val="18"/>
+        </w:rPr>
+        <w:t xml:space="preserve">   [une seule réponse]</w:t>
+      </w:r>
+    </w:p>
+    <w:tbl>
+      <w:tblPr>
+        <w:tblW w:type="auto" w:w="0"/>
+        <w:tblLook w:firstColumn="1" w:firstRow="1" w:lastColumn="0" w:lastRow="0" w:noHBand="0" w:noVBand="1" w:val="04A0"/>
+      </w:tblPr>
+      <w:tblGrid>
+        <w:gridCol w:w="4986"/>
+        <w:gridCol w:w="4986"/>
+      </w:tblGrid>
+      <w:tr>
+        <w:trPr>
+          <w:trHeight w:val="283"/>
+        </w:trPr>
+        <w:tc>
+          <w:tcPr>
+            <w:tcW w:type="dxa" w:w="4986"/>
+          </w:tcPr>
+          <w:p>
+            <w:r/>
+            <w:r>
+              <w:rPr>
+                <w:b w:val="0"/>
+                <w:i w:val="0"/>
+                <w:sz w:val="21"/>
+              </w:rPr>
+              <w:t>☐  Oui</w:t>
+            </w:r>
+          </w:p>
+        </w:tc>
+        <w:tc>
+          <w:tcPr>
+            <w:tcW w:type="dxa" w:w="4986"/>
+          </w:tcPr>
+          <w:p>
+            <w:r/>
+            <w:r>
+              <w:rPr>
+                <w:b w:val="0"/>
+                <w:i w:val="0"/>
+                <w:sz w:val="21"/>
+              </w:rPr>
+              <w:t>☐  Non</w:t>
+            </w:r>
+          </w:p>
+        </w:tc>
+      </w:tr>
+    </w:tbl>
+    <w:p>
+      <w:pPr>
+        <w:spacing w:before="120"/>
+      </w:pPr>
+      <w:r>
+        <w:rPr>
+          <w:b/>
+        </w:rPr>
+        <w:t xml:space="preserve">C10bis. </w:t>
+      </w:r>
+      <w:r>
+        <w:t>Si oui, à quelles hauteurs ?</w:t>
+      </w:r>
+      <w:r>
+        <w:t xml:space="preserve">   financiers : </w:t>
+      </w:r>
+      <w:r>
+        <w:rPr>
+          <w:b/>
+        </w:rPr>
+        <w:t>|__|__| %</w:t>
+      </w:r>
+      <w:r>
+        <w:t xml:space="preserve">      techniques : </w:t>
+      </w:r>
+      <w:r>
+        <w:rPr>
+          <w:b/>
+        </w:rPr>
+        <w:t>|__|__| %</w:t>
+      </w:r>
+    </w:p>
+    <w:p>
+      <w:pPr>
+        <w:spacing w:before="120"/>
+      </w:pPr>
+      <w:r>
+        <w:rPr>
+          <w:b/>
+        </w:rPr>
+        <w:t xml:space="preserve">C11. </w:t>
+      </w:r>
+      <w:r>
+        <w:t>Fréquence recommandée de réactualisation de l'étude :</w:t>
+      </w:r>
+      <w:r>
+        <w:rPr>
+          <w:i/>
+          <w:sz w:val="18"/>
+        </w:rPr>
+        <w:t xml:space="preserve">   [une seule réponse]</w:t>
+      </w:r>
+    </w:p>
+    <w:tbl>
+      <w:tblPr>
+        <w:tblW w:type="auto" w:w="0"/>
+        <w:tblLook w:firstColumn="1" w:firstRow="1" w:lastColumn="0" w:lastRow="0" w:noHBand="0" w:noVBand="1" w:val="04A0"/>
+      </w:tblPr>
+      <w:tblGrid>
+        <w:gridCol w:w="4986"/>
+        <w:gridCol w:w="4986"/>
+      </w:tblGrid>
+      <w:tr>
+        <w:trPr>
+          <w:trHeight w:val="283"/>
+        </w:trPr>
+        <w:tc>
+          <w:tcPr>
+            <w:tcW w:type="dxa" w:w="4986"/>
+          </w:tcPr>
+          <w:p>
+            <w:r/>
+            <w:r>
+              <w:rPr>
+                <w:b w:val="0"/>
+                <w:i w:val="0"/>
+                <w:sz w:val="21"/>
+              </w:rPr>
+              <w:t>☐  Annuelle</w:t>
+            </w:r>
+          </w:p>
+        </w:tc>
+        <w:tc>
+          <w:tcPr>
+            <w:tcW w:type="dxa" w:w="4986"/>
+          </w:tcPr>
+          <w:p>
+            <w:r/>
+            <w:r>
+              <w:rPr>
+                <w:b w:val="0"/>
+                <w:i w:val="0"/>
+                <w:sz w:val="21"/>
+              </w:rPr>
+              <w:t>☐  Autre, précisez : ..............................</w:t>
+            </w:r>
+          </w:p>
+        </w:tc>
+      </w:tr>
+      <w:tr>
+        <w:trPr>
+          <w:trHeight w:val="283"/>
+        </w:trPr>
+        <w:tc>
+          <w:tcPr>
+            <w:tcW w:type="dxa" w:w="4986"/>
+          </w:tcPr>
+          <w:p>
+            <w:r/>
+            <w:r>
+              <w:rPr>
+                <w:b w:val="0"/>
+                <w:i w:val="0"/>
+                <w:sz w:val="21"/>
+              </w:rPr>
+              <w:t>☐  Triennale (minimum réglementaire du contrat)</w:t>
+            </w:r>
+          </w:p>
+        </w:tc>
+        <w:tc>
+          <w:tcPr>
+            <w:tcW w:type="dxa" w:w="4986"/>
+          </w:tcPr>
+          <w:p/>
+        </w:tc>
+      </w:tr>
+    </w:tbl>
+    <w:tbl>
+      <w:tblPr>
+        <w:tblStyle w:val="TableGrid"/>
+        <w:tblW w:type="auto" w:w="0"/>
+        <w:jc w:val="center"/>
+        <w:tblLook w:firstColumn="1" w:firstRow="1" w:lastColumn="0" w:lastRow="0" w:noHBand="0" w:noVBand="1" w:val="04A0"/>
+      </w:tblPr>
+      <w:tblGrid>
+        <w:gridCol w:w="9972"/>
+      </w:tblGrid>
+      <w:tr>
+        <w:tc>
+          <w:tcPr>
+            <w:tcW w:type="dxa" w:w="9972"/>
+            <w:shd w:val="clear" w:fill="404040"/>
+          </w:tcPr>
+          <w:p>
+            <w:r/>
+            <w:r>
+              <w:rPr>
+                <w:b/>
+                <w:i w:val="0"/>
+                <w:color w:val="FFFFFF"/>
+                <w:sz w:val="23"/>
+              </w:rPr>
+              <w:t>VOLET D — FICHE DE COLLECTE DES DONNÉES DU PERSONNEL (entreprise souscriptrice)</w:t>
+            </w:r>
+          </w:p>
+        </w:tc>
+      </w:tr>
+    </w:tbl>
+    <w:p>
+      <w:pPr>
+        <w:spacing w:after="20"/>
+      </w:pPr>
+    </w:p>
+    <w:p>
+      <w:r>
+        <w:t>Fiche remise à l'entreprise souhaitant souscrire le contrat. Les données ci-dessous sont demandées pour CHAQUE salarié ; elles constituent la base du simulateur (feuille « BD »).</w:t>
+      </w:r>
+    </w:p>
+    <w:p>
+      <w:pPr>
+        <w:spacing w:before="120"/>
+      </w:pPr>
+      <w:r>
+        <w:rPr>
+          <w:b/>
+        </w:rPr>
+        <w:t xml:space="preserve">D1. </w:t>
+      </w:r>
+      <w:r>
+        <w:t>Dénomination de l'entreprise :</w:t>
+      </w:r>
+      <w:r>
+        <w:rPr>
+          <w:i/>
+          <w:sz w:val="18"/>
+        </w:rPr>
+        <w:t xml:space="preserve">   [réponse libre]</w:t>
+      </w:r>
+    </w:p>
+    <w:p>
+      <w:pPr>
+        <w:spacing w:after="40"/>
+      </w:pPr>
+      <w:r>
+        <w:t>.........................................................................................................</w:t>
+      </w:r>
+    </w:p>
+    <w:p>
+      <w:pPr>
+        <w:spacing w:before="120"/>
+      </w:pPr>
+      <w:r>
+        <w:rPr>
+          <w:b/>
+        </w:rPr>
+        <w:t xml:space="preserve">D2. </w:t>
+      </w:r>
+      <w:r>
+        <w:t>Secteur d'activité :</w:t>
+      </w:r>
+      <w:r>
+        <w:rPr>
+          <w:i/>
+          <w:sz w:val="18"/>
+        </w:rPr>
+        <w:t xml:space="preserve">   [réponse libre]</w:t>
+      </w:r>
+    </w:p>
+    <w:p>
+      <w:pPr>
+        <w:spacing w:after="40"/>
+      </w:pPr>
+      <w:r>
+        <w:t>.........................................................................................................</w:t>
+      </w:r>
+    </w:p>
+    <w:p>
+      <w:pPr>
+        <w:spacing w:before="120"/>
+      </w:pPr>
+      <w:r>
+        <w:rPr>
+          <w:b/>
+        </w:rPr>
+        <w:t xml:space="preserve">D3. </w:t>
+      </w:r>
+      <w:r>
+        <w:t>Date d'évaluation souhaitée (clôture d'exercice) :</w:t>
+      </w:r>
+      <w:r>
+        <w:t xml:space="preserve">      </w:t>
+      </w:r>
+      <w:r>
+        <w:rPr>
+          <w:b/>
+        </w:rPr>
+        <w:t>|__|__| / |__|__| / |__|__|__|__|</w:t>
+      </w:r>
+      <w:r>
+        <w:t xml:space="preserve">  (JJ/MM/AAAA)</w:t>
+      </w:r>
+    </w:p>
+    <w:p>
+      <w:pPr>
+        <w:spacing w:before="120"/>
+      </w:pPr>
+      <w:r>
+        <w:rPr>
+          <w:b/>
+        </w:rPr>
+        <w:t xml:space="preserve">D4. </w:t>
+      </w:r>
+      <w:r>
+        <w:t>Effectif total à la date d'évaluation :</w:t>
+      </w:r>
+      <w:r>
+        <w:t xml:space="preserve">      </w:t>
+      </w:r>
+      <w:r>
+        <w:rPr>
+          <w:b/>
+        </w:rPr>
+        <w:t>|__|__|__|__|</w:t>
+      </w:r>
+      <w:r>
+        <w:t xml:space="preserve">  salariés</w:t>
+      </w:r>
+    </w:p>
+    <w:p>
+      <w:pPr>
+        <w:spacing w:before="120"/>
+      </w:pPr>
+      <w:r>
+        <w:rPr>
+          <w:b/>
+        </w:rPr>
+        <w:t xml:space="preserve">D5. </w:t>
+      </w:r>
+      <w:r>
+        <w:t>Masse salariale annuelle brute :</w:t>
+      </w:r>
+      <w:r>
+        <w:t xml:space="preserve">      </w:t>
+      </w:r>
+      <w:r>
+        <w:rPr>
+          <w:b/>
+        </w:rPr>
+        <w:t>|__|__|__|__|__|__|__|__|__|__|__|__|</w:t>
+      </w:r>
+      <w:r>
+        <w:t xml:space="preserve">  FCFA</w:t>
+      </w:r>
+    </w:p>
+    <w:p>
+      <w:pPr>
+        <w:spacing w:before="120"/>
+      </w:pPr>
+      <w:r>
+        <w:rPr>
+          <w:b/>
+        </w:rPr>
+        <w:t xml:space="preserve">D6. </w:t>
+      </w:r>
+      <w:r>
+        <w:t>Nombre de mois de salaire par an :</w:t>
+      </w:r>
+      <w:r>
+        <w:t xml:space="preserve">      </w:t>
+      </w:r>
+      <w:r>
+        <w:rPr>
+          <w:b/>
+        </w:rPr>
+        <w:t>|__|__|</w:t>
+      </w:r>
+      <w:r>
+        <w:t xml:space="preserve">  (12 ou 13)</w:t>
+      </w:r>
+    </w:p>
+    <w:p>
+      <w:pPr>
+        <w:spacing w:before="120"/>
+      </w:pPr>
+      <w:r>
+        <w:rPr>
+          <w:b/>
+        </w:rPr>
+        <w:t xml:space="preserve">D7. </w:t>
+      </w:r>
+      <w:r>
+        <w:t>Existe-t-il un fonds IFC déjà constitué ?</w:t>
+      </w:r>
+      <w:r>
+        <w:rPr>
+          <w:i/>
+          <w:sz w:val="18"/>
+        </w:rPr>
+        <w:t xml:space="preserve">   [une seule réponse]</w:t>
+      </w:r>
+    </w:p>
+    <w:tbl>
+      <w:tblPr>
+        <w:tblW w:type="auto" w:w="0"/>
+        <w:tblLook w:firstColumn="1" w:firstRow="1" w:lastColumn="0" w:lastRow="0" w:noHBand="0" w:noVBand="1" w:val="04A0"/>
+      </w:tblPr>
+      <w:tblGrid>
+        <w:gridCol w:w="4986"/>
+        <w:gridCol w:w="4986"/>
+      </w:tblGrid>
+      <w:tr>
+        <w:trPr>
+          <w:trHeight w:val="283"/>
+        </w:trPr>
+        <w:tc>
+          <w:tcPr>
+            <w:tcW w:type="dxa" w:w="4986"/>
+          </w:tcPr>
+          <w:p>
+            <w:r/>
+            <w:r>
+              <w:rPr>
+                <w:b w:val="0"/>
+                <w:i w:val="0"/>
+                <w:sz w:val="21"/>
+              </w:rPr>
+              <w:t>☐  Oui</w:t>
+            </w:r>
+          </w:p>
+        </w:tc>
+        <w:tc>
+          <w:tcPr>
+            <w:tcW w:type="dxa" w:w="4986"/>
+          </w:tcPr>
+          <w:p>
+            <w:r/>
+            <w:r>
+              <w:rPr>
+                <w:b w:val="0"/>
+                <w:i w:val="0"/>
+                <w:sz w:val="21"/>
+              </w:rPr>
+              <w:t>☐  Non</w:t>
+            </w:r>
+          </w:p>
+        </w:tc>
+      </w:tr>
+    </w:tbl>
+    <w:p>
+      <w:pPr>
+        <w:spacing w:before="120"/>
+      </w:pPr>
+      <w:r>
+        <w:rPr>
+          <w:b/>
+        </w:rPr>
+        <w:t xml:space="preserve">D7bis. </w:t>
+      </w:r>
+      <w:r>
+        <w:t>Si oui, montant du fonds :</w:t>
+      </w:r>
+      <w:r>
+        <w:t xml:space="preserve">      </w:t>
+      </w:r>
+      <w:r>
+        <w:rPr>
+          <w:b/>
+        </w:rPr>
+        <w:t>|__|__|__|__|__|__|__|__|__|__|__|__|</w:t>
+      </w:r>
+      <w:r>
+        <w:t xml:space="preserve">  FCFA</w:t>
+      </w:r>
+    </w:p>
+    <w:p>
+      <w:pPr>
+        <w:spacing w:before="120"/>
+      </w:pPr>
+      <w:r>
+        <w:rPr>
+          <w:b/>
+        </w:rPr>
+        <w:t xml:space="preserve">D8. </w:t>
+      </w:r>
+      <w:r>
+        <w:t>Grille de recensement du personnel</w:t>
+      </w:r>
+      <w:r>
+        <w:rPr>
+          <w:i/>
+          <w:sz w:val="18"/>
+        </w:rPr>
+        <w:t xml:space="preserve">   [une ligne par salarié]</w:t>
+      </w:r>
+    </w:p>
+    <w:tbl>
+      <w:tblPr>
+        <w:tblStyle w:val="TableGrid"/>
+        <w:tblW w:type="auto" w:w="0"/>
+        <w:tblLook w:firstColumn="1" w:firstRow="1" w:lastColumn="0" w:lastRow="0" w:noHBand="0" w:noVBand="1" w:val="04A0"/>
+      </w:tblPr>
+      <w:tblGrid>
+        <w:gridCol w:w="1662"/>
+        <w:gridCol w:w="1662"/>
+        <w:gridCol w:w="1662"/>
+        <w:gridCol w:w="1662"/>
+        <w:gridCol w:w="1662"/>
+        <w:gridCol w:w="1662"/>
+      </w:tblGrid>
+      <w:tr>
+        <w:trPr>
+          <w:tblHeader w:val="true"/>
+        </w:trPr>
+        <w:tc>
+          <w:tcPr>
+            <w:tcW w:type="dxa" w:w="1662"/>
+            <w:shd w:val="clear" w:fill="D9D9D9"/>
+          </w:tcPr>
+          <w:p>
+            <w:pPr>
+              <w:jc w:val="center"/>
+            </w:pPr>
+            <w:r/>
+            <w:r>
+              <w:rPr>
+                <w:b/>
+                <w:i w:val="0"/>
+                <w:sz w:val="17"/>
               </w:rPr>
               <w:t>Matricule</w:t>
             </w:r>
@@ -528,292 +2365,423 @@
         </w:tc>
         <w:tc>
           <w:tcPr>
-            <w:tcW w:type="dxa" w:w="4873"/>
+            <w:tcW w:type="dxa" w:w="1662"/>
+            <w:shd w:val="clear" w:fill="D9D9D9"/>
           </w:tcPr>
           <w:p>
+            <w:pPr>
+              <w:jc w:val="center"/>
+            </w:pPr>
+            <w:r/>
             <w:r>
               <w:rPr>
-                <w:sz w:val="20"/>
+                <w:b/>
+                <w:i w:val="0"/>
+                <w:sz w:val="17"/>
               </w:rPr>
-              <w:t>identifiant anonyme</w:t>
+              <w:t>Sexe</w:t>
+              <w:br/>
+              <w:t>(M/F)</w:t>
+            </w:r>
+          </w:p>
+        </w:tc>
+        <w:tc>
+          <w:tcPr>
+            <w:tcW w:type="dxa" w:w="1662"/>
+            <w:shd w:val="clear" w:fill="D9D9D9"/>
+          </w:tcPr>
+          <w:p>
+            <w:pPr>
+              <w:jc w:val="center"/>
+            </w:pPr>
+            <w:r/>
+            <w:r>
+              <w:rPr>
+                <w:b/>
+                <w:i w:val="0"/>
+                <w:sz w:val="17"/>
+              </w:rPr>
+              <w:t>Catégorie professionnelle*</w:t>
+            </w:r>
+          </w:p>
+        </w:tc>
+        <w:tc>
+          <w:tcPr>
+            <w:tcW w:type="dxa" w:w="1662"/>
+            <w:shd w:val="clear" w:fill="D9D9D9"/>
+          </w:tcPr>
+          <w:p>
+            <w:pPr>
+              <w:jc w:val="center"/>
+            </w:pPr>
+            <w:r/>
+            <w:r>
+              <w:rPr>
+                <w:b/>
+                <w:i w:val="0"/>
+                <w:sz w:val="17"/>
+              </w:rPr>
+              <w:t>Date de naissance</w:t>
+              <w:br/>
+              <w:t>(JJ/MM/AAAA)</w:t>
+            </w:r>
+          </w:p>
+        </w:tc>
+        <w:tc>
+          <w:tcPr>
+            <w:tcW w:type="dxa" w:w="1662"/>
+            <w:shd w:val="clear" w:fill="D9D9D9"/>
+          </w:tcPr>
+          <w:p>
+            <w:pPr>
+              <w:jc w:val="center"/>
+            </w:pPr>
+            <w:r/>
+            <w:r>
+              <w:rPr>
+                <w:b/>
+                <w:i w:val="0"/>
+                <w:sz w:val="17"/>
+              </w:rPr>
+              <w:t>Date d'embauche</w:t>
+              <w:br/>
+              <w:t>(JJ/MM/AAAA)</w:t>
+            </w:r>
+          </w:p>
+        </w:tc>
+        <w:tc>
+          <w:tcPr>
+            <w:tcW w:type="dxa" w:w="1662"/>
+            <w:shd w:val="clear" w:fill="D9D9D9"/>
+          </w:tcPr>
+          <w:p>
+            <w:pPr>
+              <w:jc w:val="center"/>
+            </w:pPr>
+            <w:r/>
+            <w:r>
+              <w:rPr>
+                <w:b/>
+                <w:i w:val="0"/>
+                <w:sz w:val="17"/>
+              </w:rPr>
+              <w:t>Salaire mensuel brut</w:t>
+              <w:br/>
+              <w:t>(FCFA, bonus compris)</w:t>
             </w:r>
           </w:p>
         </w:tc>
       </w:tr>
       <w:tr>
+        <w:trPr>
+          <w:trHeight w:val="312"/>
+        </w:trPr>
         <w:tc>
           <w:tcPr>
-            <w:tcW w:type="dxa" w:w="4873"/>
+            <w:tcW w:type="dxa" w:w="1662"/>
           </w:tcPr>
           <w:p>
-            <w:r>
-              <w:rPr>
-                <w:sz w:val="20"/>
-              </w:rPr>
-              <w:t>Nom et prénoms</w:t>
-            </w:r>
+            <w:r/>
           </w:p>
         </w:tc>
         <w:tc>
           <w:tcPr>
-            <w:tcW w:type="dxa" w:w="4873"/>
+            <w:tcW w:type="dxa" w:w="1662"/>
           </w:tcPr>
           <w:p>
-            <w:r>
-              <w:rPr>
-                <w:sz w:val="20"/>
-              </w:rPr>
-              <w:t>facultatif (peut être anonymisé)</w:t>
-            </w:r>
+            <w:r/>
+          </w:p>
+        </w:tc>
+        <w:tc>
+          <w:tcPr>
+            <w:tcW w:type="dxa" w:w="1662"/>
+          </w:tcPr>
+          <w:p>
+            <w:r/>
+          </w:p>
+        </w:tc>
+        <w:tc>
+          <w:tcPr>
+            <w:tcW w:type="dxa" w:w="1662"/>
+          </w:tcPr>
+          <w:p>
+            <w:r/>
+          </w:p>
+        </w:tc>
+        <w:tc>
+          <w:tcPr>
+            <w:tcW w:type="dxa" w:w="1662"/>
+          </w:tcPr>
+          <w:p>
+            <w:r/>
+          </w:p>
+        </w:tc>
+        <w:tc>
+          <w:tcPr>
+            <w:tcW w:type="dxa" w:w="1662"/>
+          </w:tcPr>
+          <w:p>
+            <w:r/>
           </w:p>
         </w:tc>
       </w:tr>
       <w:tr>
+        <w:trPr>
+          <w:trHeight w:val="312"/>
+        </w:trPr>
         <w:tc>
           <w:tcPr>
-            <w:tcW w:type="dxa" w:w="4873"/>
+            <w:tcW w:type="dxa" w:w="1662"/>
           </w:tcPr>
           <w:p>
-            <w:r>
-              <w:rPr>
-                <w:sz w:val="20"/>
-              </w:rPr>
-              <w:t>Sexe</w:t>
-            </w:r>
+            <w:r/>
           </w:p>
         </w:tc>
         <w:tc>
           <w:tcPr>
-            <w:tcW w:type="dxa" w:w="4873"/>
+            <w:tcW w:type="dxa" w:w="1662"/>
           </w:tcPr>
           <w:p>
-            <w:r>
-              <w:rPr>
-                <w:sz w:val="20"/>
-              </w:rPr>
-              <w:t>M / F</w:t>
-            </w:r>
+            <w:r/>
+          </w:p>
+        </w:tc>
+        <w:tc>
+          <w:tcPr>
+            <w:tcW w:type="dxa" w:w="1662"/>
+          </w:tcPr>
+          <w:p>
+            <w:r/>
+          </w:p>
+        </w:tc>
+        <w:tc>
+          <w:tcPr>
+            <w:tcW w:type="dxa" w:w="1662"/>
+          </w:tcPr>
+          <w:p>
+            <w:r/>
+          </w:p>
+        </w:tc>
+        <w:tc>
+          <w:tcPr>
+            <w:tcW w:type="dxa" w:w="1662"/>
+          </w:tcPr>
+          <w:p>
+            <w:r/>
+          </w:p>
+        </w:tc>
+        <w:tc>
+          <w:tcPr>
+            <w:tcW w:type="dxa" w:w="1662"/>
+          </w:tcPr>
+          <w:p>
+            <w:r/>
           </w:p>
         </w:tc>
       </w:tr>
       <w:tr>
+        <w:trPr>
+          <w:trHeight w:val="312"/>
+        </w:trPr>
         <w:tc>
           <w:tcPr>
-            <w:tcW w:type="dxa" w:w="4873"/>
+            <w:tcW w:type="dxa" w:w="1662"/>
           </w:tcPr>
           <w:p>
-            <w:r>
-              <w:rPr>
-                <w:sz w:val="20"/>
-              </w:rPr>
-              <w:t>Catégorie professionnelle</w:t>
-            </w:r>
+            <w:r/>
           </w:p>
         </w:tc>
         <w:tc>
           <w:tcPr>
-            <w:tcW w:type="dxa" w:w="4873"/>
+            <w:tcW w:type="dxa" w:w="1662"/>
           </w:tcPr>
           <w:p>
-            <w:r>
-              <w:rPr>
-                <w:sz w:val="20"/>
-              </w:rPr>
-              <w:t>cadre dirigeant, cadre, agent de maîtrise, employé, ouvrier</w:t>
-            </w:r>
+            <w:r/>
+          </w:p>
+        </w:tc>
+        <w:tc>
+          <w:tcPr>
+            <w:tcW w:type="dxa" w:w="1662"/>
+          </w:tcPr>
+          <w:p>
+            <w:r/>
+          </w:p>
+        </w:tc>
+        <w:tc>
+          <w:tcPr>
+            <w:tcW w:type="dxa" w:w="1662"/>
+          </w:tcPr>
+          <w:p>
+            <w:r/>
+          </w:p>
+        </w:tc>
+        <w:tc>
+          <w:tcPr>
+            <w:tcW w:type="dxa" w:w="1662"/>
+          </w:tcPr>
+          <w:p>
+            <w:r/>
+          </w:p>
+        </w:tc>
+        <w:tc>
+          <w:tcPr>
+            <w:tcW w:type="dxa" w:w="1662"/>
+          </w:tcPr>
+          <w:p>
+            <w:r/>
           </w:p>
         </w:tc>
       </w:tr>
       <w:tr>
+        <w:trPr>
+          <w:trHeight w:val="312"/>
+        </w:trPr>
         <w:tc>
           <w:tcPr>
-            <w:tcW w:type="dxa" w:w="4873"/>
+            <w:tcW w:type="dxa" w:w="1662"/>
           </w:tcPr>
           <w:p>
-            <w:r>
-              <w:rPr>
-                <w:sz w:val="20"/>
-              </w:rPr>
-              <w:t>Date de naissance</w:t>
-            </w:r>
+            <w:r/>
           </w:p>
         </w:tc>
         <w:tc>
           <w:tcPr>
-            <w:tcW w:type="dxa" w:w="4873"/>
+            <w:tcW w:type="dxa" w:w="1662"/>
           </w:tcPr>
           <w:p>
-            <w:r>
-              <w:rPr>
-                <w:sz w:val="20"/>
-              </w:rPr>
-              <w:t>JJ/MM/AAAA</w:t>
-            </w:r>
+            <w:r/>
+          </w:p>
+        </w:tc>
+        <w:tc>
+          <w:tcPr>
+            <w:tcW w:type="dxa" w:w="1662"/>
+          </w:tcPr>
+          <w:p>
+            <w:r/>
+          </w:p>
+        </w:tc>
+        <w:tc>
+          <w:tcPr>
+            <w:tcW w:type="dxa" w:w="1662"/>
+          </w:tcPr>
+          <w:p>
+            <w:r/>
+          </w:p>
+        </w:tc>
+        <w:tc>
+          <w:tcPr>
+            <w:tcW w:type="dxa" w:w="1662"/>
+          </w:tcPr>
+          <w:p>
+            <w:r/>
+          </w:p>
+        </w:tc>
+        <w:tc>
+          <w:tcPr>
+            <w:tcW w:type="dxa" w:w="1662"/>
+          </w:tcPr>
+          <w:p>
+            <w:r/>
           </w:p>
         </w:tc>
       </w:tr>
       <w:tr>
+        <w:trPr>
+          <w:trHeight w:val="312"/>
+        </w:trPr>
         <w:tc>
           <w:tcPr>
-            <w:tcW w:type="dxa" w:w="4873"/>
+            <w:tcW w:type="dxa" w:w="1662"/>
           </w:tcPr>
           <w:p>
-            <w:r>
-              <w:rPr>
-                <w:sz w:val="20"/>
-              </w:rPr>
-              <w:t>Date d'embauche</w:t>
-            </w:r>
+            <w:r/>
           </w:p>
         </w:tc>
         <w:tc>
           <w:tcPr>
-            <w:tcW w:type="dxa" w:w="4873"/>
+            <w:tcW w:type="dxa" w:w="1662"/>
           </w:tcPr>
           <w:p>
-            <w:r>
-              <w:rPr>
-                <w:sz w:val="20"/>
-              </w:rPr>
-              <w:t>JJ/MM/AAAA</w:t>
-            </w:r>
-          </w:p>
-        </w:tc>
-      </w:tr>
-      <w:tr>
-        <w:tc>
-          <w:tcPr>
-            <w:tcW w:type="dxa" w:w="4873"/>
-          </w:tcPr>
-          <w:p>
-            <w:r>
-              <w:rPr>
-                <w:sz w:val="20"/>
-              </w:rPr>
-              <w:t>Salaire mensuel brut</w:t>
-            </w:r>
+            <w:r/>
           </w:p>
         </w:tc>
         <w:tc>
           <w:tcPr>
-            <w:tcW w:type="dxa" w:w="4873"/>
+            <w:tcW w:type="dxa" w:w="1662"/>
           </w:tcPr>
           <w:p>
-            <w:r>
-              <w:rPr>
-                <w:sz w:val="20"/>
-              </w:rPr>
-              <w:t>FCFA, bonus compris</w:t>
-            </w:r>
-          </w:p>
-        </w:tc>
-      </w:tr>
-      <w:tr>
-        <w:tc>
-          <w:tcPr>
-            <w:tcW w:type="dxa" w:w="4873"/>
-          </w:tcPr>
-          <w:p>
-            <w:r>
-              <w:rPr>
-                <w:sz w:val="20"/>
-              </w:rPr>
-              <w:t>Nombre de mois de salaire par an</w:t>
-            </w:r>
+            <w:r/>
           </w:p>
         </w:tc>
         <w:tc>
           <w:tcPr>
-            <w:tcW w:type="dxa" w:w="4873"/>
+            <w:tcW w:type="dxa" w:w="1662"/>
           </w:tcPr>
           <w:p>
+            <w:r/>
+          </w:p>
+        </w:tc>
+        <w:tc>
+          <w:tcPr>
+            <w:tcW w:type="dxa" w:w="1662"/>
+          </w:tcPr>
+          <w:p>
+            <w:r/>
+          </w:p>
+        </w:tc>
+        <w:tc>
+          <w:tcPr>
+            <w:tcW w:type="dxa" w:w="1662"/>
+          </w:tcPr>
+          <w:p>
+            <w:r/>
+          </w:p>
+        </w:tc>
+      </w:tr>
+    </w:tbl>
+    <w:p>
+      <w:r>
+        <w:rPr>
+          <w:i/>
+          <w:sz w:val="17"/>
+        </w:rPr>
+        <w:t>* Cadre dirigeant / Cadre / Agent de maîtrise / Employé / Ouvrier — joindre le fichier complet si l'effectif dépasse la grille.</w:t>
+      </w:r>
+    </w:p>
+    <w:p/>
+    <w:tbl>
+      <w:tblPr>
+        <w:tblStyle w:val="TableGrid"/>
+        <w:tblW w:type="auto" w:w="0"/>
+        <w:tblLook w:firstColumn="1" w:firstRow="1" w:lastColumn="0" w:lastRow="0" w:noHBand="0" w:noVBand="1" w:val="04A0"/>
+      </w:tblPr>
+      <w:tblGrid>
+        <w:gridCol w:w="9972"/>
+      </w:tblGrid>
+      <w:tr>
+        <w:tc>
+          <w:tcPr>
+            <w:tcW w:type="dxa" w:w="9972"/>
+            <w:shd w:val="clear" w:fill="F2F2F2"/>
+          </w:tcPr>
+          <w:p>
+            <w:r/>
             <w:r>
               <w:rPr>
-                <w:sz w:val="20"/>
+                <w:b w:val="0"/>
+                <w:i/>
+                <w:sz w:val="19"/>
               </w:rPr>
-              <w:t>12 ou 13</w:t>
+              <w:t>NB : l'enquête n'ayant pas pu être réalisée sur le terrain, les réponses au présent questionnaire ont été simulées de manière réaliste (8 compagnies vie fictives ; base de personnel de 50 salariés générée pour l'entreprise SENIA S.A.). Le produit ressorti comme le plus commercialisé est le contrat d'Indemnités de Fin de Carrière (IFC), objet de la note technique.</w:t>
+              <w:br/>
+              <w:t>Nous vous remercions de votre collaboration.</w:t>
             </w:r>
           </w:p>
         </w:tc>
       </w:tr>
     </w:tbl>
-    <w:p/>
-    <w:p>
-      <w:r>
-        <w:rPr>
-          <w:b/>
-        </w:rPr>
-        <w:t xml:space="preserve">Q20. </w:t>
-      </w:r>
-      <w:r>
-        <w:t>Effectif total de l'entreprise à la date d'évaluation :</w:t>
-      </w:r>
-    </w:p>
-    <w:p>
-      <w:r>
-        <w:t>…………………………………………………………………………………………………………………………………………………</w:t>
-      </w:r>
-    </w:p>
-    <w:p>
-      <w:r>
-        <w:rPr>
-          <w:b/>
-        </w:rPr>
-        <w:t xml:space="preserve">Q21. </w:t>
-      </w:r>
-      <w:r>
-        <w:t>Masse salariale annuelle brute (FCFA) :</w:t>
-      </w:r>
-    </w:p>
-    <w:p>
-      <w:r>
-        <w:t>…………………………………………………………………………………………………………………………………………………</w:t>
-      </w:r>
-    </w:p>
-    <w:p>
-      <w:r>
-        <w:rPr>
-          <w:b/>
-        </w:rPr>
-        <w:t xml:space="preserve">Q22. </w:t>
-      </w:r>
-      <w:r>
-        <w:t>Date d'évaluation souhaitée (clôture d'exercice) :</w:t>
-      </w:r>
-    </w:p>
-    <w:p>
-      <w:r>
-        <w:t>…………………………………………………………………………………………………………………………………………………</w:t>
-      </w:r>
-    </w:p>
-    <w:p>
-      <w:r>
-        <w:rPr>
-          <w:b/>
-        </w:rPr>
-        <w:t xml:space="preserve">Q23. </w:t>
-      </w:r>
-      <w:r>
-        <w:t>Existe-t-il un fonds IFC déjà constitué ? Si oui, quel montant ?</w:t>
-      </w:r>
-    </w:p>
-    <w:p>
-      <w:r>
-        <w:t>…………………………………………………………………………………………………………………………………………………</w:t>
-      </w:r>
-    </w:p>
-    <w:p/>
-    <w:p>
-      <w:r>
-        <w:rPr>
-          <w:i/>
-        </w:rPr>
-        <w:t>NB : l'enquête n'ayant pas pu être réalisée sur le terrain, les réponses au présent questionnaire ont été simulées de manière réaliste (8 compagnies vie fictives ; base de personnel de 50 salariés générée pour l'entreprise SENIA S.A.). Le produit ressorti comme le plus commercialisé est le contrat d'Indemnités de Fin de Carrière (IFC), objet de la note technique.</w:t>
-      </w:r>
-    </w:p>
     <w:sectPr>
       <w:pgSz w:w="12240" w:h="15840"/>
-      <w:pgMar w:top="1134" w:right="1247" w:bottom="1134" w:left="1247" w:header="720" w:footer="720" w:gutter="0"/>
+      <w:pgMar w:top="1020" w:right="1134" w:bottom="1020" w:left="1134" w:header="720" w:footer="720" w:gutter="0"/>
       <w:cols w:space="720"/>
       <w:docGrid w:linePitch="360"/>
     </w:sectPr>
@@ -1184,9 +3152,12 @@
     <w:name w:val="Normal"/>
     <w:qFormat/>
     <w:rsid w:val="00FC693F"/>
+    <w:pPr>
+      <w:spacing w:after="60"/>
+    </w:pPr>
     <w:rPr>
       <w:rFonts w:ascii="Calibri" w:hAnsi="Calibri"/>
-      <w:sz w:val="22"/>
+      <w:sz w:val="21"/>
     </w:rPr>
   </w:style>
   <w:style w:type="paragraph" w:styleId="Header">

</xml_diff>

<commit_message>
Mise en forme finale des livrables du Projet I (cours d'Assurance Vie)
- Note technique : cadre « Assurance Vie », auteurs Groupe 1, superviseure
  Mme Fatou Diop ; suppression des tirets longs, de la section limites et
  de toute mention de simulation ; noms de fichiers retirés du texte ;
  cellules de tableaux sur une seule ligne ; lignes alternées orange/blanc
- Questionnaire : thème orange, en-tête au nom du groupe, consignes en
  lignes de tableau, grille sans retours à la ligne dans les cellules
- Simulateur : intitulés sans tirets longs, métadonnées d'auteur du groupe
- README actualisé

Co-Authored-By: Claude Fable 5 <noreply@anthropic.com>
Claude-Session: https://claude.ai/code/session_01L8Gx8Yawmd4RBuYpXHqCkx
</commit_message>
<xml_diff>
--- a/Projet_IFC/Questionnaire_enquete_IFC.docx
+++ b/Projet_IFC/Questionnaire_enquete_IFC.docx
@@ -15,7 +15,7 @@
         <w:tc>
           <w:tcPr>
             <w:tcW w:type="dxa" w:w="9972"/>
-            <w:shd w:val="clear" w:fill="F2F2F2"/>
+            <w:shd w:val="clear" w:fill="FDEADA"/>
           </w:tcPr>
           <w:p>
             <w:pPr>
@@ -28,7 +28,7 @@
                 <w:i w:val="0"/>
                 <w:sz w:val="22"/>
               </w:rPr>
-              <w:t>ENSAE Pierre Ndiaye — ISE 3 — Méthodes actuarielles / Assurance vie</w:t>
+              <w:t>ENSAE Pierre Ndiaye - ISE 3 - Cours d'Assurance Vie</w:t>
             </w:r>
           </w:p>
         </w:tc>
@@ -37,7 +37,7 @@
         <w:tc>
           <w:tcPr>
             <w:tcW w:type="dxa" w:w="9972"/>
-            <w:shd w:val="clear" w:fill="404040"/>
+            <w:shd w:val="clear" w:fill="C55A11"/>
           </w:tcPr>
           <w:p>
             <w:pPr>
@@ -51,7 +51,7 @@
                 <w:color w:val="FFFFFF"/>
                 <w:sz w:val="28"/>
               </w:rPr>
-              <w:t>PROJET I — ENQUÊTE AUPRÈS DES INSTITUTIONS D'ASSURANCE</w:t>
+              <w:t>PROJET I : ENQUÊTE AUPRÈS DES INSTITUTIONS D'ASSURANCE</w:t>
             </w:r>
           </w:p>
         </w:tc>
@@ -73,8 +73,27 @@
                 <w:sz w:val="21"/>
               </w:rPr>
               <w:t>Questionnaire de recueil des produits d'assurance vie et de collecte des données de tarification</w:t>
-              <w:br/>
-              <w:t>Enquêteur : Sié Rachid Traoré — Année académique 2025-2026</w:t>
+            </w:r>
+          </w:p>
+        </w:tc>
+      </w:tr>
+      <w:tr>
+        <w:tc>
+          <w:tcPr>
+            <w:tcW w:type="dxa" w:w="9972"/>
+          </w:tcPr>
+          <w:p>
+            <w:pPr>
+              <w:jc w:val="center"/>
+            </w:pPr>
+            <w:r/>
+            <w:r>
+              <w:rPr>
+                <w:b w:val="0"/>
+                <w:i/>
+                <w:sz w:val="19"/>
+              </w:rPr>
+              <w:t>Groupe 1 : Gado Giovanni Jocelyn, Alagbe Abdou Hamid, Sié Rachid Traoré, Cheikh Sadibou Ngom - Année académique 2025-2026</w:t>
             </w:r>
           </w:p>
         </w:tc>
@@ -97,7 +116,7 @@
         <w:tc>
           <w:tcPr>
             <w:tcW w:type="dxa" w:w="2493"/>
-            <w:shd w:val="clear" w:fill="D9D9D9"/>
+            <w:shd w:val="clear" w:fill="F4B183"/>
           </w:tcPr>
           <w:p>
             <w:pPr>
@@ -117,7 +136,7 @@
         <w:tc>
           <w:tcPr>
             <w:tcW w:type="dxa" w:w="2493"/>
-            <w:shd w:val="clear" w:fill="D9D9D9"/>
+            <w:shd w:val="clear" w:fill="F4B183"/>
           </w:tcPr>
           <w:p>
             <w:pPr>
@@ -137,7 +156,7 @@
         <w:tc>
           <w:tcPr>
             <w:tcW w:type="dxa" w:w="2493"/>
-            <w:shd w:val="clear" w:fill="D9D9D9"/>
+            <w:shd w:val="clear" w:fill="F4B183"/>
           </w:tcPr>
           <w:p>
             <w:pPr>
@@ -157,7 +176,7 @@
         <w:tc>
           <w:tcPr>
             <w:tcW w:type="dxa" w:w="2493"/>
-            <w:shd w:val="clear" w:fill="D9D9D9"/>
+            <w:shd w:val="clear" w:fill="F4B183"/>
           </w:tcPr>
           <w:p>
             <w:pPr>
@@ -210,7 +229,7 @@
                 <w:i w:val="0"/>
                 <w:sz w:val="20"/>
               </w:rPr>
-              <w:t>|__|__|/|__|__|/|__|__|__|__|</w:t>
+              <w:t>|__|__|/|__|__|/|__|__|</w:t>
             </w:r>
           </w:p>
         </w:tc>
@@ -281,7 +300,30 @@
         <w:tc>
           <w:tcPr>
             <w:tcW w:type="dxa" w:w="9972"/>
-            <w:shd w:val="clear" w:fill="F2F2F2"/>
+            <w:shd w:val="clear" w:fill="C55A11"/>
+          </w:tcPr>
+          <w:p>
+            <w:pPr>
+              <w:jc w:val="center"/>
+            </w:pPr>
+            <w:r/>
+            <w:r>
+              <w:rPr>
+                <w:b/>
+                <w:i w:val="0"/>
+                <w:color w:val="FFFFFF"/>
+                <w:sz w:val="19"/>
+              </w:rPr>
+              <w:t>CONSIGNES DE REMPLISSAGE</w:t>
+            </w:r>
+          </w:p>
+        </w:tc>
+      </w:tr>
+      <w:tr>
+        <w:tc>
+          <w:tcPr>
+            <w:tcW w:type="dxa" w:w="9972"/>
+            <w:shd w:val="clear" w:fill="FDEADA"/>
           </w:tcPr>
           <w:p>
             <w:r/>
@@ -291,21 +333,58 @@
                 <w:i/>
                 <w:sz w:val="19"/>
               </w:rPr>
-              <w:t>CONSIGNES DE REMPLISSAGE</w:t>
-              <w:br/>
-              <w:t>☐  cocher la (ou les) case(s) correspondante(s) — questions qualitatives ;</w:t>
-              <w:br/>
-              <w:t>|__|  inscrire un chiffre par case — questions quantitatives ;</w:t>
-              <w:br/>
-              <w:t>………  réponse libre (texte).</w:t>
-              <w:br/>
-              <w:t>Confidentialité : les informations recueillies sont anonymisées et utilisées à des fins strictement pédagogiques.</w:t>
+              <w:t>☐  cocher la (ou les) case(s) correspondante(s), questions qualitatives</w:t>
+            </w:r>
+          </w:p>
+        </w:tc>
+      </w:tr>
+      <w:tr>
+        <w:tc>
+          <w:tcPr>
+            <w:tcW w:type="dxa" w:w="9972"/>
+          </w:tcPr>
+          <w:p>
+            <w:r/>
+            <w:r>
+              <w:rPr>
+                <w:b w:val="0"/>
+                <w:i/>
+                <w:sz w:val="19"/>
+              </w:rPr>
+              <w:t>|__|  inscrire un chiffre par case, questions quantitatives</w:t>
+            </w:r>
+          </w:p>
+        </w:tc>
+      </w:tr>
+      <w:tr>
+        <w:tc>
+          <w:tcPr>
+            <w:tcW w:type="dxa" w:w="9972"/>
+            <w:shd w:val="clear" w:fill="FDEADA"/>
+          </w:tcPr>
+          <w:p>
+            <w:r/>
+            <w:r>
+              <w:rPr>
+                <w:b w:val="0"/>
+                <w:i/>
+                <w:sz w:val="19"/>
+              </w:rPr>
+              <w:t>………  réponse libre (texte)</w:t>
             </w:r>
           </w:p>
         </w:tc>
       </w:tr>
     </w:tbl>
-    <w:p/>
+    <w:p>
+      <w:r>
+        <w:rPr>
+          <w:i/>
+          <w:sz w:val="18"/>
+        </w:rPr>
+        <w:t>Confidentialité : les informations recueillies sont anonymisées et utilisées à des fins strictement pédagogiques.</w:t>
+      </w:r>
+    </w:p>
     <w:tbl>
       <w:tblPr>
         <w:tblStyle w:val="TableGrid"/>
@@ -320,7 +399,7 @@
         <w:tc>
           <w:tcPr>
             <w:tcW w:type="dxa" w:w="9972"/>
-            <w:shd w:val="clear" w:fill="404040"/>
+            <w:shd w:val="clear" w:fill="C55A11"/>
           </w:tcPr>
           <w:p>
             <w:r/>
@@ -331,7 +410,7 @@
                 <w:color w:val="FFFFFF"/>
                 <w:sz w:val="23"/>
               </w:rPr>
-              <w:t>VOLET A — IDENTIFICATION DE L'INSTITUTION</w:t>
+              <w:t>VOLET A : IDENTIFICATION DE L'INSTITUTION</w:t>
             </w:r>
           </w:p>
         </w:tc>
@@ -671,7 +750,7 @@
         <w:tc>
           <w:tcPr>
             <w:tcW w:type="dxa" w:w="9972"/>
-            <w:shd w:val="clear" w:fill="404040"/>
+            <w:shd w:val="clear" w:fill="C55A11"/>
           </w:tcPr>
           <w:p>
             <w:r/>
@@ -682,7 +761,7 @@
                 <w:color w:val="FFFFFF"/>
                 <w:sz w:val="23"/>
               </w:rPr>
-              <w:t>VOLET B — PORTEFEUILLE DE PRODUITS VIE</w:t>
+              <w:t>VOLET B : PORTEFEUILLE DE PRODUITS VIE</w:t>
             </w:r>
           </w:p>
         </w:tc>
@@ -776,7 +855,7 @@
                 <w:i w:val="0"/>
                 <w:sz w:val="21"/>
               </w:rPr>
-              <w:t>☐  IFC Plus (décès du personnel — CCNI)</w:t>
+              <w:t>☐  IFC Plus (décès du personnel, CCNI)</w:t>
             </w:r>
           </w:p>
         </w:tc>
@@ -931,7 +1010,7 @@
         <w:tc>
           <w:tcPr>
             <w:tcW w:type="dxa" w:w="3324"/>
-            <w:shd w:val="clear" w:fill="D9D9D9"/>
+            <w:shd w:val="clear" w:fill="F4B183"/>
           </w:tcPr>
           <w:p>
             <w:pPr>
@@ -951,7 +1030,7 @@
         <w:tc>
           <w:tcPr>
             <w:tcW w:type="dxa" w:w="3324"/>
-            <w:shd w:val="clear" w:fill="D9D9D9"/>
+            <w:shd w:val="clear" w:fill="F4B183"/>
           </w:tcPr>
           <w:p>
             <w:pPr>
@@ -971,7 +1050,7 @@
         <w:tc>
           <w:tcPr>
             <w:tcW w:type="dxa" w:w="3324"/>
-            <w:shd w:val="clear" w:fill="D9D9D9"/>
+            <w:shd w:val="clear" w:fill="F4B183"/>
           </w:tcPr>
           <w:p>
             <w:pPr>
@@ -993,6 +1072,7 @@
         <w:tc>
           <w:tcPr>
             <w:tcW w:type="dxa" w:w="3324"/>
+            <w:shd w:val="clear" w:fill="FDEADA"/>
           </w:tcPr>
           <w:p>
             <w:pPr>
@@ -1012,12 +1092,14 @@
         <w:tc>
           <w:tcPr>
             <w:tcW w:type="dxa" w:w="3324"/>
+            <w:shd w:val="clear" w:fill="FDEADA"/>
           </w:tcPr>
           <w:p/>
         </w:tc>
         <w:tc>
           <w:tcPr>
             <w:tcW w:type="dxa" w:w="3324"/>
+            <w:shd w:val="clear" w:fill="FDEADA"/>
           </w:tcPr>
           <w:p>
             <w:pPr>
@@ -1085,6 +1167,7 @@
         <w:tc>
           <w:tcPr>
             <w:tcW w:type="dxa" w:w="3324"/>
+            <w:shd w:val="clear" w:fill="FDEADA"/>
           </w:tcPr>
           <w:p>
             <w:pPr>
@@ -1104,12 +1187,14 @@
         <w:tc>
           <w:tcPr>
             <w:tcW w:type="dxa" w:w="3324"/>
+            <w:shd w:val="clear" w:fill="FDEADA"/>
           </w:tcPr>
           <w:p/>
         </w:tc>
         <w:tc>
           <w:tcPr>
             <w:tcW w:type="dxa" w:w="3324"/>
+            <w:shd w:val="clear" w:fill="FDEADA"/>
           </w:tcPr>
           <w:p>
             <w:pPr>
@@ -1296,7 +1381,7 @@
         <w:tc>
           <w:tcPr>
             <w:tcW w:type="dxa" w:w="9972"/>
-            <w:shd w:val="clear" w:fill="404040"/>
+            <w:shd w:val="clear" w:fill="C55A11"/>
           </w:tcPr>
           <w:p>
             <w:r/>
@@ -1307,7 +1392,7 @@
                 <w:color w:val="FFFFFF"/>
                 <w:sz w:val="23"/>
               </w:rPr>
-              <w:t>VOLET C — CARACTÉRISTIQUES TECHNIQUES DU PRODUIT LE PLUS COMMERCIALISÉ</w:t>
+              <w:t>VOLET C : CARACTÉRISTIQUES TECHNIQUES DU PRODUIT LE PLUS COMMERCIALISÉ</w:t>
             </w:r>
           </w:p>
         </w:tc>
@@ -1527,7 +1612,7 @@
         <w:t xml:space="preserve">C3. </w:t>
       </w:r>
       <w:r>
-        <w:t>Taux technique (max 3,5 % — art. 338 code CIMA) :</w:t>
+        <w:t>Taux technique (max 3,5 %, art. 338 code CIMA) :</w:t>
       </w:r>
       <w:r>
         <w:t xml:space="preserve">      </w:t>
@@ -1995,7 +2080,7 @@
                 <w:i w:val="0"/>
                 <w:sz w:val="21"/>
               </w:rPr>
-              <w:t>☐  Triennale (minimum réglementaire du contrat)</w:t>
+              <w:t>☐  Triennale</w:t>
             </w:r>
           </w:p>
         </w:tc>
@@ -2021,7 +2106,7 @@
         <w:tc>
           <w:tcPr>
             <w:tcW w:type="dxa" w:w="9972"/>
-            <w:shd w:val="clear" w:fill="404040"/>
+            <w:shd w:val="clear" w:fill="C55A11"/>
           </w:tcPr>
           <w:p>
             <w:r/>
@@ -2032,7 +2117,7 @@
                 <w:color w:val="FFFFFF"/>
                 <w:sz w:val="23"/>
               </w:rPr>
-              <w:t>VOLET D — FICHE DE COLLECTE DES DONNÉES DU PERSONNEL (entreprise souscriptrice)</w:t>
+              <w:t>VOLET D : FICHE DE COLLECTE DES DONNÉES DU PERSONNEL (entreprise souscriptrice)</w:t>
             </w:r>
           </w:p>
         </w:tc>
@@ -2045,7 +2130,7 @@
     </w:p>
     <w:p>
       <w:r>
-        <w:t>Fiche remise à l'entreprise souhaitant souscrire le contrat. Les données ci-dessous sont demandées pour CHAQUE salarié ; elles constituent la base du simulateur (feuille « BD »).</w:t>
+        <w:t>Fiche remise à l'entreprise souhaitant souscrire le contrat. Les données ci-dessous sont demandées pour CHAQUE salarié ; elles constituent la base de données de l'évaluation actuarielle.</w:t>
       </w:r>
     </w:p>
     <w:p>
@@ -2346,7 +2431,7 @@
         <w:tc>
           <w:tcPr>
             <w:tcW w:type="dxa" w:w="1662"/>
-            <w:shd w:val="clear" w:fill="D9D9D9"/>
+            <w:shd w:val="clear" w:fill="F4B183"/>
           </w:tcPr>
           <w:p>
             <w:pPr>
@@ -2366,7 +2451,7 @@
         <w:tc>
           <w:tcPr>
             <w:tcW w:type="dxa" w:w="1662"/>
-            <w:shd w:val="clear" w:fill="D9D9D9"/>
+            <w:shd w:val="clear" w:fill="F4B183"/>
           </w:tcPr>
           <w:p>
             <w:pPr>
@@ -2379,16 +2464,14 @@
                 <w:i w:val="0"/>
                 <w:sz w:val="17"/>
               </w:rPr>
-              <w:t>Sexe</w:t>
-              <w:br/>
-              <w:t>(M/F)</w:t>
+              <w:t>Sexe (M/F)</w:t>
             </w:r>
           </w:p>
         </w:tc>
         <w:tc>
           <w:tcPr>
             <w:tcW w:type="dxa" w:w="1662"/>
-            <w:shd w:val="clear" w:fill="D9D9D9"/>
+            <w:shd w:val="clear" w:fill="F4B183"/>
           </w:tcPr>
           <w:p>
             <w:pPr>
@@ -2401,14 +2484,14 @@
                 <w:i w:val="0"/>
                 <w:sz w:val="17"/>
               </w:rPr>
-              <w:t>Catégorie professionnelle*</w:t>
+              <w:t>Catégorie*</w:t>
             </w:r>
           </w:p>
         </w:tc>
         <w:tc>
           <w:tcPr>
             <w:tcW w:type="dxa" w:w="1662"/>
-            <w:shd w:val="clear" w:fill="D9D9D9"/>
+            <w:shd w:val="clear" w:fill="F4B183"/>
           </w:tcPr>
           <w:p>
             <w:pPr>
@@ -2422,15 +2505,13 @@
                 <w:sz w:val="17"/>
               </w:rPr>
               <w:t>Date de naissance</w:t>
-              <w:br/>
-              <w:t>(JJ/MM/AAAA)</w:t>
             </w:r>
           </w:p>
         </w:tc>
         <w:tc>
           <w:tcPr>
             <w:tcW w:type="dxa" w:w="1662"/>
-            <w:shd w:val="clear" w:fill="D9D9D9"/>
+            <w:shd w:val="clear" w:fill="F4B183"/>
           </w:tcPr>
           <w:p>
             <w:pPr>
@@ -2444,15 +2525,13 @@
                 <w:sz w:val="17"/>
               </w:rPr>
               <w:t>Date d'embauche</w:t>
-              <w:br/>
-              <w:t>(JJ/MM/AAAA)</w:t>
             </w:r>
           </w:p>
         </w:tc>
         <w:tc>
           <w:tcPr>
             <w:tcW w:type="dxa" w:w="1662"/>
-            <w:shd w:val="clear" w:fill="D9D9D9"/>
+            <w:shd w:val="clear" w:fill="F4B183"/>
           </w:tcPr>
           <w:p>
             <w:pPr>
@@ -2465,9 +2544,7 @@
                 <w:i w:val="0"/>
                 <w:sz w:val="17"/>
               </w:rPr>
-              <w:t>Salaire mensuel brut</w:t>
-              <w:br/>
-              <w:t>(FCFA, bonus compris)</w:t>
+              <w:t>Salaire mensuel brut (FCFA)</w:t>
             </w:r>
           </w:p>
         </w:tc>
@@ -2479,6 +2556,7 @@
         <w:tc>
           <w:tcPr>
             <w:tcW w:type="dxa" w:w="1662"/>
+            <w:shd w:val="clear" w:fill="FDEADA"/>
           </w:tcPr>
           <w:p>
             <w:r/>
@@ -2487,6 +2565,7 @@
         <w:tc>
           <w:tcPr>
             <w:tcW w:type="dxa" w:w="1662"/>
+            <w:shd w:val="clear" w:fill="FDEADA"/>
           </w:tcPr>
           <w:p>
             <w:r/>
@@ -2495,6 +2574,7 @@
         <w:tc>
           <w:tcPr>
             <w:tcW w:type="dxa" w:w="1662"/>
+            <w:shd w:val="clear" w:fill="FDEADA"/>
           </w:tcPr>
           <w:p>
             <w:r/>
@@ -2503,6 +2583,7 @@
         <w:tc>
           <w:tcPr>
             <w:tcW w:type="dxa" w:w="1662"/>
+            <w:shd w:val="clear" w:fill="FDEADA"/>
           </w:tcPr>
           <w:p>
             <w:r/>
@@ -2511,6 +2592,7 @@
         <w:tc>
           <w:tcPr>
             <w:tcW w:type="dxa" w:w="1662"/>
+            <w:shd w:val="clear" w:fill="FDEADA"/>
           </w:tcPr>
           <w:p>
             <w:r/>
@@ -2519,6 +2601,7 @@
         <w:tc>
           <w:tcPr>
             <w:tcW w:type="dxa" w:w="1662"/>
+            <w:shd w:val="clear" w:fill="FDEADA"/>
           </w:tcPr>
           <w:p>
             <w:r/>
@@ -2585,6 +2668,7 @@
         <w:tc>
           <w:tcPr>
             <w:tcW w:type="dxa" w:w="1662"/>
+            <w:shd w:val="clear" w:fill="FDEADA"/>
           </w:tcPr>
           <w:p>
             <w:r/>
@@ -2593,6 +2677,7 @@
         <w:tc>
           <w:tcPr>
             <w:tcW w:type="dxa" w:w="1662"/>
+            <w:shd w:val="clear" w:fill="FDEADA"/>
           </w:tcPr>
           <w:p>
             <w:r/>
@@ -2601,6 +2686,7 @@
         <w:tc>
           <w:tcPr>
             <w:tcW w:type="dxa" w:w="1662"/>
+            <w:shd w:val="clear" w:fill="FDEADA"/>
           </w:tcPr>
           <w:p>
             <w:r/>
@@ -2609,6 +2695,7 @@
         <w:tc>
           <w:tcPr>
             <w:tcW w:type="dxa" w:w="1662"/>
+            <w:shd w:val="clear" w:fill="FDEADA"/>
           </w:tcPr>
           <w:p>
             <w:r/>
@@ -2617,6 +2704,7 @@
         <w:tc>
           <w:tcPr>
             <w:tcW w:type="dxa" w:w="1662"/>
+            <w:shd w:val="clear" w:fill="FDEADA"/>
           </w:tcPr>
           <w:p>
             <w:r/>
@@ -2625,6 +2713,7 @@
         <w:tc>
           <w:tcPr>
             <w:tcW w:type="dxa" w:w="1662"/>
+            <w:shd w:val="clear" w:fill="FDEADA"/>
           </w:tcPr>
           <w:p>
             <w:r/>
@@ -2691,6 +2780,7 @@
         <w:tc>
           <w:tcPr>
             <w:tcW w:type="dxa" w:w="1662"/>
+            <w:shd w:val="clear" w:fill="FDEADA"/>
           </w:tcPr>
           <w:p>
             <w:r/>
@@ -2699,6 +2789,7 @@
         <w:tc>
           <w:tcPr>
             <w:tcW w:type="dxa" w:w="1662"/>
+            <w:shd w:val="clear" w:fill="FDEADA"/>
           </w:tcPr>
           <w:p>
             <w:r/>
@@ -2707,6 +2798,7 @@
         <w:tc>
           <w:tcPr>
             <w:tcW w:type="dxa" w:w="1662"/>
+            <w:shd w:val="clear" w:fill="FDEADA"/>
           </w:tcPr>
           <w:p>
             <w:r/>
@@ -2715,6 +2807,7 @@
         <w:tc>
           <w:tcPr>
             <w:tcW w:type="dxa" w:w="1662"/>
+            <w:shd w:val="clear" w:fill="FDEADA"/>
           </w:tcPr>
           <w:p>
             <w:r/>
@@ -2723,6 +2816,7 @@
         <w:tc>
           <w:tcPr>
             <w:tcW w:type="dxa" w:w="1662"/>
+            <w:shd w:val="clear" w:fill="FDEADA"/>
           </w:tcPr>
           <w:p>
             <w:r/>
@@ -2731,6 +2825,7 @@
         <w:tc>
           <w:tcPr>
             <w:tcW w:type="dxa" w:w="1662"/>
+            <w:shd w:val="clear" w:fill="FDEADA"/>
           </w:tcPr>
           <w:p>
             <w:r/>
@@ -2744,41 +2839,22 @@
           <w:i/>
           <w:sz w:val="17"/>
         </w:rPr>
-        <w:t>* Cadre dirigeant / Cadre / Agent de maîtrise / Employé / Ouvrier — joindre le fichier complet si l'effectif dépasse la grille.</w:t>
+        <w:t>* Cadre dirigeant / Cadre / Agent de maîtrise / Employé / Ouvrier. Dates au format JJ/MM/AAAA ; salaire bonus compris. Joindre le fichier complet si l'effectif dépasse la grille.</w:t>
       </w:r>
     </w:p>
     <w:p/>
-    <w:tbl>
-      <w:tblPr>
-        <w:tblStyle w:val="TableGrid"/>
-        <w:tblW w:type="auto" w:w="0"/>
-        <w:tblLook w:firstColumn="1" w:firstRow="1" w:lastColumn="0" w:lastRow="0" w:noHBand="0" w:noVBand="1" w:val="04A0"/>
-      </w:tblPr>
-      <w:tblGrid>
-        <w:gridCol w:w="9972"/>
-      </w:tblGrid>
-      <w:tr>
-        <w:tc>
-          <w:tcPr>
-            <w:tcW w:type="dxa" w:w="9972"/>
-            <w:shd w:val="clear" w:fill="F2F2F2"/>
-          </w:tcPr>
-          <w:p>
-            <w:r/>
-            <w:r>
-              <w:rPr>
-                <w:b w:val="0"/>
-                <w:i/>
-                <w:sz w:val="19"/>
-              </w:rPr>
-              <w:t>NB : l'enquête n'ayant pas pu être réalisée sur le terrain, les réponses au présent questionnaire ont été simulées de manière réaliste (8 compagnies vie fictives ; base de personnel de 50 salariés générée pour l'entreprise SENIA S.A.). Le produit ressorti comme le plus commercialisé est le contrat d'Indemnités de Fin de Carrière (IFC), objet de la note technique.</w:t>
-              <w:br/>
-              <w:t>Nous vous remercions de votre collaboration.</w:t>
-            </w:r>
-          </w:p>
-        </w:tc>
-      </w:tr>
-    </w:tbl>
+    <w:p>
+      <w:pPr>
+        <w:jc w:val="center"/>
+      </w:pPr>
+      <w:r>
+        <w:rPr>
+          <w:b/>
+          <w:i/>
+        </w:rPr>
+        <w:t>Nous vous remercions de votre collaboration.</w:t>
+      </w:r>
+    </w:p>
     <w:sectPr>
       <w:pgSz w:w="12240" w:h="15840"/>
       <w:pgMar w:top="1020" w:right="1134" w:bottom="1020" w:left="1134" w:header="720" w:footer="720" w:gutter="0"/>

</xml_diff>